<commit_message>
Add Step B11: build the HTML deck (self-contained skeleton in prompt); Deliver renumbered to B12
</commit_message>
<xml_diff>
--- a/Pyramid_Principle_Workbook.docx
+++ b/Pyramid_Principle_Workbook.docx
@@ -253,7 +253,7 @@
               <w:rPr>
                 <w:sz w:val="18"/>
               </w:rPr>
-              <w:t>B1–B11</w:t>
+              <w:t>B1–B12</w:t>
             </w:r>
           </w:p>
         </w:tc>
@@ -7253,6 +7253,11 @@
     </w:tbl>
     <w:p/>
     <w:p>
+      <w:r>
+        <w:br w:type="page"/>
+      </w:r>
+    </w:p>
+    <w:p>
       <w:pPr>
         <w:pStyle w:val="Heading2"/>
       </w:pPr>
@@ -7260,7 +7265,589 @@
         <w:rPr>
           <w:color w:val="1F4FA8"/>
         </w:rPr>
-        <w:t>Step B11 — Deliver and record the outcome</w:t>
+        <w:t>Step B11 — Build the HTML deck</w:t>
+      </w:r>
+    </w:p>
+    <w:p>
+      <w:r>
+        <w:rPr>
+          <w:b w:val="0"/>
+          <w:i/>
+          <w:color w:val="718096"/>
+        </w:rPr>
+        <w:t>Change the adjusted storyboard into one HTML file with the full deck.</w:t>
+      </w:r>
+    </w:p>
+    <w:p>
+      <w:r>
+        <w:rPr>
+          <w:b/>
+          <w:color w:val="718096"/>
+          <w:sz w:val="18"/>
+        </w:rPr>
+        <w:t xml:space="preserve">Input: </w:t>
+      </w:r>
+      <w:r>
+        <w:rPr>
+          <w:color w:val="718096"/>
+          <w:sz w:val="18"/>
+        </w:rPr>
+        <w:t xml:space="preserve">adjusted storyboard (B10) + exhibit specifications (B6) + speaker notes   </w:t>
+      </w:r>
+      <w:r>
+        <w:rPr>
+          <w:b/>
+          <w:color w:val="718096"/>
+          <w:sz w:val="18"/>
+        </w:rPr>
+        <w:t xml:space="preserve">Output: </w:t>
+      </w:r>
+      <w:r>
+        <w:rPr>
+          <w:color w:val="718096"/>
+          <w:sz w:val="18"/>
+        </w:rPr>
+        <w:t>one self-contained HTML file with the complete deck</w:t>
+      </w:r>
+    </w:p>
+    <w:tbl>
+      <w:tblPr>
+        <w:tblStyle w:val="TableGrid"/>
+        <w:tblW w:type="auto" w:w="0"/>
+        <w:tblLook w:firstColumn="1" w:firstRow="1" w:lastColumn="0" w:lastRow="0" w:noHBand="0" w:noVBand="1" w:val="04A0"/>
+      </w:tblPr>
+      <w:tblGrid>
+        <w:gridCol w:w="8640"/>
+      </w:tblGrid>
+      <w:tr>
+        <w:tc>
+          <w:tcPr>
+            <w:tcW w:type="dxa" w:w="8640"/>
+            <w:shd w:fill="FDE8E8"/>
+          </w:tcPr>
+          <w:p>
+            <w:r>
+              <w:rPr>
+                <w:b/>
+                <w:color w:val="991B1B"/>
+                <w:sz w:val="18"/>
+              </w:rPr>
+              <w:t>RULES FOR THE FILE</w:t>
+            </w:r>
+          </w:p>
+          <w:p>
+            <w:r>
+              <w:rPr>
+                <w:sz w:val="20"/>
+              </w:rPr>
+              <w:t>One HTML file. No external libraries. No fonts, images, or scripts from the network. The file must work without a network connection.</w:t>
+            </w:r>
+          </w:p>
+          <w:p>
+            <w:r>
+              <w:rPr>
+                <w:sz w:val="20"/>
+              </w:rPr>
+              <w:t>System fonts only: 'Segoe UI' with sans-serif fallback. Corporate machines block font downloads.</w:t>
+            </w:r>
+          </w:p>
+          <w:p>
+            <w:r>
+              <w:rPr>
+                <w:sz w:val="20"/>
+              </w:rPr>
+              <w:t>Charts as HTML/CSS or inline SVG. Bar charts: div elements with widths from the data. Line and scatter charts: inline SVG. Tables: HTML tables.</w:t>
+            </w:r>
+          </w:p>
+          <w:p>
+            <w:r>
+              <w:rPr>
+                <w:sz w:val="20"/>
+              </w:rPr>
+              <w:t>One slide = one claim = one exhibit, from the B10 storyboard. Do not add slides. Do not remove slides.</w:t>
+            </w:r>
+          </w:p>
+        </w:tc>
+      </w:tr>
+    </w:tbl>
+    <w:p/>
+    <w:p>
+      <w:pPr>
+        <w:pStyle w:val="Heading3"/>
+      </w:pPr>
+      <w:r>
+        <w:rPr>
+          <w:color w:val="166534"/>
+        </w:rPr>
+        <w:t>Copilot procedure — do the steps in sequence</w:t>
+      </w:r>
+    </w:p>
+    <w:p>
+      <w:pPr>
+        <w:pStyle w:val="ListNumber"/>
+      </w:pPr>
+      <w:r>
+        <w:t>Take the adjusted storyboard table from B10. Make one slide section for each row, in order.</w:t>
+      </w:r>
+    </w:p>
+    <w:p>
+      <w:pPr>
+        <w:pStyle w:val="ListNumber"/>
+      </w:pPr>
+      <w:r>
+        <w:t>Use the HTML skeleton in the prompt. Do not change the design tokens or the navigation script.</w:t>
+      </w:r>
+    </w:p>
+    <w:p>
+      <w:pPr>
+        <w:pStyle w:val="ListNumber"/>
+      </w:pPr>
+      <w:r>
+        <w:t>Put the claim title at the top of each slide. Two lines maximum.</w:t>
+      </w:r>
+    </w:p>
+    <w:p>
+      <w:pPr>
+        <w:pStyle w:val="ListNumber"/>
+      </w:pPr>
+      <w:r>
+        <w:t>Build each exhibit from its B6 specification. Use the real data from the evidence register. Apply the one highlight: the highlighted element gets the accent colour, all other elements get grey.</w:t>
+      </w:r>
+    </w:p>
+    <w:p>
+      <w:pPr>
+        <w:pStyle w:val="ListNumber"/>
+      </w:pPr>
+      <w:r>
+        <w:t>Put the source line at the bottom of each slide: source, date range, n=, units.</w:t>
+      </w:r>
+    </w:p>
+    <w:p>
+      <w:pPr>
+        <w:pStyle w:val="ListNumber"/>
+      </w:pPr>
+      <w:r>
+        <w:t>Put the speaker notes for each slide in a notes block. The 'n' key shows and hides the notes.</w:t>
+      </w:r>
+    </w:p>
+    <w:p>
+      <w:pPr>
+        <w:pStyle w:val="ListNumber"/>
+      </w:pPr>
+      <w:r>
+        <w:t>Make the two text-only slides: the Governing Thought (large type, alone) and the ask (decision + gate + date, alone).</w:t>
+      </w:r>
+    </w:p>
+    <w:p>
+      <w:pPr>
+        <w:pStyle w:val="ListNumber"/>
+      </w:pPr>
+      <w:r>
+        <w:t>Output the complete file in one code block. Do not cut the file. If the chat cuts the output, continue in a second code block from the exact cut point.</w:t>
+      </w:r>
+    </w:p>
+    <w:tbl>
+      <w:tblPr>
+        <w:tblStyle w:val="TableGrid"/>
+        <w:tblW w:type="auto" w:w="0"/>
+        <w:tblLook w:firstColumn="1" w:firstRow="1" w:lastColumn="0" w:lastRow="0" w:noHBand="0" w:noVBand="1" w:val="04A0"/>
+      </w:tblPr>
+      <w:tblGrid>
+        <w:gridCol w:w="8640"/>
+      </w:tblGrid>
+      <w:tr>
+        <w:tc>
+          <w:tcPr>
+            <w:tcW w:type="dxa" w:w="8640"/>
+            <w:shd w:fill="F0EBFB"/>
+          </w:tcPr>
+          <w:p>
+            <w:r>
+              <w:rPr>
+                <w:b/>
+                <w:color w:val="5B21B6"/>
+                <w:sz w:val="18"/>
+              </w:rPr>
+              <w:t>PROMPT FOR COPILOT — copy the full block below into Copilot chat</w:t>
+            </w:r>
+          </w:p>
+          <w:p>
+            <w:r>
+              <w:rPr>
+                <w:rFonts w:ascii="Consolas" w:hAnsi="Consolas" w:eastAsia="Consolas"/>
+                <w:sz w:val="17"/>
+              </w:rPr>
+              <w:t>You do Step B11 (HTML Deck Build) of a Minto presentation build.</w:t>
+              <w:br/>
+              <w:br/>
+              <w:t>Adjusted storyboard: [PASTE from B10]</w:t>
+              <w:br/>
+              <w:t>Exhibit specifications: [PASTE from B6]</w:t>
+              <w:br/>
+              <w:t>Evidence register (the real numbers): [PASTE]</w:t>
+              <w:br/>
+              <w:t>Speaker notes: [PASTE]</w:t>
+              <w:br/>
+              <w:br/>
+              <w:t>Build ONE self-contained HTML file with the complete deck.</w:t>
+              <w:br/>
+              <w:br/>
+              <w:t>Rules:</w:t>
+              <w:br/>
+              <w:t>1. No external libraries, fonts, images, or scripts. The file must work without a network connection.</w:t>
+              <w:br/>
+              <w:t>2. One slide for each storyboard row, in order. One slide = one claim = one exhibit.</w:t>
+              <w:br/>
+              <w:t>3. Charts: bar charts as div elements with widths from the data; line/scatter as inline SVG; tables as HTML tables. Use the real numbers from the evidence register. Do not invent data.</w:t>
+              <w:br/>
+              <w:t>4. Highlight: the one highlighted element gets #1f4fa8. All other data elements get #b0b8c4.</w:t>
+              <w:br/>
+              <w:t>5. Each slide: claim title at the top (2 lines maximum), exhibit in the centre (about 90% of the body), source line at the bottom.</w:t>
+              <w:br/>
+              <w:t>6. Speaker notes in a hidden block on each slide. The 'n' key shows and hides them.</w:t>
+              <w:br/>
+              <w:t>7. Use this skeleton. Keep the tokens and the script. Add the slides.</w:t>
+              <w:br/>
+              <w:br/>
+              <w:t>&lt;!DOCTYPE html&gt;</w:t>
+              <w:br/>
+              <w:t>&lt;html lang="en"&gt;&lt;head&gt;&lt;meta charset="UTF-8"&gt;</w:t>
+              <w:br/>
+              <w:t>&lt;title&gt;[DECK TITLE]&lt;/title&gt;</w:t>
+              <w:br/>
+              <w:t>&lt;style&gt;</w:t>
+              <w:br/>
+              <w:t>:root{--bg:#f5f4f1;--surface:#ffffff;--text:#0f1923;--muted:#718096;--border:#dde1e7;--accent:#1f4fa8;--grey:#b0b8c4;--panel:#0f2744;}</w:t>
+              <w:br/>
+              <w:t>*{box-sizing:border-box;margin:0;padding:0;}</w:t>
+              <w:br/>
+              <w:t>body{font-family:'Segoe UI',system-ui,sans-serif;background:var(--bg);color:var(--text);}</w:t>
+              <w:br/>
+              <w:t>.slide{display:none;min-height:100vh;padding:48px 64px;flex-direction:column;background:var(--surface);}</w:t>
+              <w:br/>
+              <w:t>.slide.active{display:flex;}</w:t>
+              <w:br/>
+              <w:t>.slide h1{font-size:26px;line-height:1.3;max-width:960px;margin-bottom:24px;}</w:t>
+              <w:br/>
+              <w:t>.exhibit{flex:1;display:flex;align-items:center;justify-content:center;}</w:t>
+              <w:br/>
+              <w:t>.source{font-size:11px;color:var(--muted);border-top:1px solid var(--border);padding-top:8px;}</w:t>
+              <w:br/>
+              <w:t>.notes{display:none;position:fixed;bottom:56px;left:16px;right:16px;background:var(--panel);color:#fff;padding:16px;font-size:13px;border-radius:4px;}</w:t>
+              <w:br/>
+              <w:t>.notes.show{display:block;}</w:t>
+              <w:br/>
+              <w:t>.nav{position:fixed;bottom:16px;right:16px;font-size:13px;color:var(--muted);}</w:t>
+              <w:br/>
+              <w:t>.nav button{padding:6px 14px;border:1px solid var(--border);background:var(--surface);cursor:pointer;}</w:t>
+              <w:br/>
+              <w:t>.bar-row{display:flex;align-items:center;gap:12px;margin:10px 0;font-size:14px;}</w:t>
+              <w:br/>
+              <w:t>.bar-row .label{width:180px;text-align:right;}</w:t>
+              <w:br/>
+              <w:t>.bar-row .bar{height:26px;background:var(--grey);}</w:t>
+              <w:br/>
+              <w:t>.bar-row .bar.hl{background:var(--accent);}</w:t>
+              <w:br/>
+              <w:t>.bar-row .val{font-weight:600;}</w:t>
+              <w:br/>
+              <w:t>&lt;/style&gt;&lt;/head&gt;&lt;body&gt;</w:t>
+              <w:br/>
+              <w:br/>
+              <w:t>&lt;section class="slide active"&gt;</w:t>
+              <w:br/>
+              <w:t xml:space="preserve">  &lt;h1&gt;[CLAIM TITLE]&lt;/h1&gt;</w:t>
+              <w:br/>
+              <w:t xml:space="preserve">  &lt;div class="exhibit"&gt;[EXHIBIT]&lt;/div&gt;</w:t>
+              <w:br/>
+              <w:t xml:space="preserve">  &lt;div class="source"&gt;Source: [..]&lt;/div&gt;</w:t>
+              <w:br/>
+              <w:t xml:space="preserve">  &lt;div class="notes"&gt;[SPEAKER NOTES]&lt;/div&gt;</w:t>
+              <w:br/>
+              <w:t>&lt;/section&gt;</w:t>
+              <w:br/>
+              <w:t>&lt;!-- more slides --&gt;</w:t>
+              <w:br/>
+              <w:br/>
+              <w:t>&lt;div class="nav"&gt;</w:t>
+              <w:br/>
+              <w:t xml:space="preserve">  &lt;button onclick="mv(-1)"&gt;&amp;larr;&lt;/button&gt;</w:t>
+              <w:br/>
+              <w:t xml:space="preserve">  &lt;span id="ctr"&gt;&lt;/span&gt;</w:t>
+              <w:br/>
+              <w:t xml:space="preserve">  &lt;button onclick="mv(1)"&gt;&amp;rarr;&lt;/button&gt;</w:t>
+              <w:br/>
+              <w:t>&lt;/div&gt;</w:t>
+              <w:br/>
+              <w:t>&lt;script&gt;</w:t>
+              <w:br/>
+              <w:t>var s=document.querySelectorAll('.slide'),i=0;</w:t>
+              <w:br/>
+              <w:t>function show(n){s[i].classList.remove('active');i=(n+s.length)%s.length;s[i].classList.add('active');document.getElementById('ctr').textContent=(i+1)+' / '+s.length;}</w:t>
+              <w:br/>
+              <w:t>function mv(d){show(i+d);}</w:t>
+              <w:br/>
+              <w:t>document.addEventListener('keydown',function(e){if(e.key==='ArrowRight')mv(1);if(e.key==='ArrowLeft')mv(-1);if(e.key==='n')s[i].querySelector('.notes').classList.toggle('show');});</w:t>
+              <w:br/>
+              <w:t>show(0);</w:t>
+              <w:br/>
+              <w:t>&lt;/script&gt;&lt;/body&gt;&lt;/html&gt;</w:t>
+              <w:br/>
+              <w:br/>
+              <w:t>Output: the complete file in one code block. If the output is cut, continue in a second code block from the exact cut point.</w:t>
+            </w:r>
+          </w:p>
+        </w:tc>
+      </w:tr>
+    </w:tbl>
+    <w:p/>
+    <w:tbl>
+      <w:tblPr>
+        <w:tblStyle w:val="TableGrid"/>
+        <w:tblW w:type="auto" w:w="0"/>
+        <w:tblLook w:firstColumn="1" w:firstRow="1" w:lastColumn="0" w:lastRow="0" w:noHBand="0" w:noVBand="1" w:val="04A0"/>
+      </w:tblPr>
+      <w:tblGrid>
+        <w:gridCol w:w="8640"/>
+      </w:tblGrid>
+      <w:tr>
+        <w:tc>
+          <w:tcPr>
+            <w:tcW w:type="dxa" w:w="8640"/>
+            <w:shd w:fill="E6F4EC"/>
+          </w:tcPr>
+          <w:p>
+            <w:r>
+              <w:rPr>
+                <w:b/>
+                <w:color w:val="166534"/>
+                <w:sz w:val="18"/>
+              </w:rPr>
+              <w:t>HOW TO SAVE AND OPEN THE FILE</w:t>
+            </w:r>
+          </w:p>
+          <w:p>
+            <w:r>
+              <w:rPr>
+                <w:sz w:val="20"/>
+              </w:rPr>
+              <w:t>1. Copy the full code block from Copilot.</w:t>
+            </w:r>
+          </w:p>
+          <w:p>
+            <w:r>
+              <w:rPr>
+                <w:sz w:val="20"/>
+              </w:rPr>
+              <w:t>2. Paste it into Notepad.</w:t>
+            </w:r>
+          </w:p>
+          <w:p>
+            <w:r>
+              <w:rPr>
+                <w:sz w:val="20"/>
+              </w:rPr>
+              <w:t>3. Save as deck.html. Set "Save as type" to "All files". Set the encoding to UTF-8.</w:t>
+            </w:r>
+          </w:p>
+          <w:p>
+            <w:r>
+              <w:rPr>
+                <w:sz w:val="20"/>
+              </w:rPr>
+              <w:t>4. Open the file in Edge. Use the arrow keys to move. Use the 'n' key for the notes.</w:t>
+            </w:r>
+          </w:p>
+        </w:tc>
+      </w:tr>
+    </w:tbl>
+    <w:p/>
+    <w:tbl>
+      <w:tblPr>
+        <w:tblStyle w:val="TableGrid"/>
+        <w:tblW w:type="auto" w:w="0"/>
+        <w:tblLook w:firstColumn="1" w:firstRow="1" w:lastColumn="0" w:lastRow="0" w:noHBand="0" w:noVBand="1" w:val="04A0"/>
+      </w:tblPr>
+      <w:tblGrid>
+        <w:gridCol w:w="8640"/>
+      </w:tblGrid>
+      <w:tr>
+        <w:tc>
+          <w:tcPr>
+            <w:tcW w:type="dxa" w:w="8640"/>
+            <w:shd w:fill="FFF8E6"/>
+          </w:tcPr>
+          <w:p>
+            <w:r>
+              <w:rPr>
+                <w:b/>
+                <w:color w:val="D4820A"/>
+                <w:sz w:val="18"/>
+              </w:rPr>
+              <w:t>YOUR REVIEW CHECKLIST</w:t>
+            </w:r>
+          </w:p>
+          <w:p>
+            <w:r>
+              <w:rPr>
+                <w:sz w:val="20"/>
+              </w:rPr>
+              <w:t>✓ The file opens and all slides show. The counter shows the correct total.</w:t>
+            </w:r>
+          </w:p>
+          <w:p>
+            <w:r>
+              <w:rPr>
+                <w:sz w:val="20"/>
+              </w:rPr>
+              <w:t>✓ Step through the full deck with the titles only. The argument stands. This is the title-read test in the browser.</w:t>
+            </w:r>
+          </w:p>
+          <w:p>
+            <w:r>
+              <w:rPr>
+                <w:sz w:val="20"/>
+              </w:rPr>
+              <w:t>✓ Each exhibit matches its B6 specification. One message. One highlight in the accent colour.</w:t>
+            </w:r>
+          </w:p>
+          <w:p>
+            <w:r>
+              <w:rPr>
+                <w:sz w:val="20"/>
+              </w:rPr>
+              <w:t>✓ Check five numbers against the evidence register. If one is wrong, check all.</w:t>
+            </w:r>
+          </w:p>
+          <w:p>
+            <w:r>
+              <w:rPr>
+                <w:sz w:val="20"/>
+              </w:rPr>
+              <w:t>✓ The file works without a network connection. Turn the network off and open it again.</w:t>
+            </w:r>
+          </w:p>
+          <w:p>
+            <w:r>
+              <w:rPr>
+                <w:sz w:val="20"/>
+              </w:rPr>
+              <w:t>✓ The 'n' key shows the correct notes on each slide.</w:t>
+            </w:r>
+          </w:p>
+        </w:tc>
+      </w:tr>
+    </w:tbl>
+    <w:p/>
+    <w:tbl>
+      <w:tblPr>
+        <w:tblStyle w:val="TableGrid"/>
+        <w:tblW w:type="auto" w:w="0"/>
+        <w:tblLook w:firstColumn="1" w:firstRow="1" w:lastColumn="0" w:lastRow="0" w:noHBand="0" w:noVBand="1" w:val="04A0"/>
+      </w:tblPr>
+      <w:tblGrid>
+        <w:gridCol w:w="8640"/>
+      </w:tblGrid>
+      <w:tr>
+        <w:tc>
+          <w:tcPr>
+            <w:tcW w:type="dxa" w:w="8640"/>
+            <w:shd w:fill="E8EEF8"/>
+          </w:tcPr>
+          <w:p>
+            <w:r>
+              <w:rPr>
+                <w:b/>
+                <w:color w:val="1F4FA8"/>
+                <w:sz w:val="18"/>
+              </w:rPr>
+              <w:t>OUTPUT — Deck file name + location</w:t>
+            </w:r>
+          </w:p>
+        </w:tc>
+      </w:tr>
+      <w:tr>
+        <w:tc>
+          <w:tcPr>
+            <w:tcW w:type="dxa" w:w="8640"/>
+          </w:tcPr>
+          <w:p/>
+          <w:p/>
+          <w:p/>
+          <w:p/>
+          <w:p/>
+        </w:tc>
+      </w:tr>
+      <w:tr>
+        <w:tc>
+          <w:tcPr>
+            <w:tcW w:type="dxa" w:w="8640"/>
+            <w:shd w:fill="E8EEF8"/>
+          </w:tcPr>
+          <w:p>
+            <w:r>
+              <w:rPr>
+                <w:b/>
+                <w:color w:val="1F4FA8"/>
+                <w:sz w:val="18"/>
+              </w:rPr>
+              <w:t>OUTPUT — Defects found + repairs (slide # | defect | repair requested | repaired?)</w:t>
+            </w:r>
+          </w:p>
+        </w:tc>
+      </w:tr>
+      <w:tr>
+        <w:tc>
+          <w:tcPr>
+            <w:tcW w:type="dxa" w:w="8640"/>
+          </w:tcPr>
+          <w:p/>
+          <w:p/>
+          <w:p/>
+          <w:p/>
+          <w:p/>
+        </w:tc>
+      </w:tr>
+    </w:tbl>
+    <w:p/>
+    <w:tbl>
+      <w:tblPr>
+        <w:tblStyle w:val="TableGrid"/>
+        <w:tblW w:type="auto" w:w="0"/>
+        <w:tblLook w:firstColumn="1" w:firstRow="1" w:lastColumn="0" w:lastRow="0" w:noHBand="0" w:noVBand="1" w:val="04A0"/>
+      </w:tblPr>
+      <w:tblGrid>
+        <w:gridCol w:w="8640"/>
+      </w:tblGrid>
+      <w:tr>
+        <w:tc>
+          <w:tcPr>
+            <w:tcW w:type="dxa" w:w="8640"/>
+            <w:shd w:fill="E8EEF8"/>
+          </w:tcPr>
+          <w:p>
+            <w:r>
+              <w:rPr>
+                <w:b/>
+                <w:color w:val="1F4FA8"/>
+                <w:sz w:val="20"/>
+              </w:rPr>
+              <w:t>GATE: The deck opens without a network. The numbers match the register. The titles carry the argument.</w:t>
+            </w:r>
+          </w:p>
+        </w:tc>
+      </w:tr>
+    </w:tbl>
+    <w:p/>
+    <w:p>
+      <w:pPr>
+        <w:pStyle w:val="Heading2"/>
+      </w:pPr>
+      <w:r>
+        <w:rPr>
+          <w:color w:val="1F4FA8"/>
+        </w:rPr>
+        <w:t>Step B12 — Deliver and record the outcome</w:t>
       </w:r>
     </w:p>
     <w:p>
@@ -7287,7 +7874,7 @@
           <w:color w:val="718096"/>
           <w:sz w:val="18"/>
         </w:rPr>
-        <w:t xml:space="preserve">final deck + Q&amp;A sheet (B10)   </w:t>
+        <w:t xml:space="preserve">HTML deck (B11) + Q&amp;A sheet (B10)   </w:t>
       </w:r>
       <w:r>
         <w:rPr>

</xml_diff>

<commit_message>
Verification layer + deck spacing fix
- Session state header: Copilot told what's done, must ask numbered
  questions before producing when info is missing
- Verification protocol: self-check snippet, independent verifier prompt
  (new chat), human-only checks
- B11 skeleton: exhibits fill width (fixes huge spacing), 40px bars/18px
  type, built-in QA overlay on 'q' key (tested: flags planted defects)
- B11 checklist reordered: machine check -> visual -> data -> independent
</commit_message>
<xml_diff>
--- a/Pyramid_Principle_Workbook.docx
+++ b/Pyramid_Principle_Workbook.docx
@@ -70,7 +70,7 @@
         <w:pStyle w:val="ListNumber"/>
       </w:pPr>
       <w:r>
-        <w:t>Paste the step prompt into Copilot. Each step has a prepared prompt. Attach your inputs to the prompt.</w:t>
+        <w:t>Paste the session state header, then the step prompt, into Copilot. The state header (below) tells Copilot what is already done. Attach your inputs.</w:t>
       </w:r>
     </w:p>
     <w:p>
@@ -105,6 +105,222 @@
           <w:i w:val="0"/>
         </w:rPr>
         <w:t>To use this document with Copilot directly: attach this file to the Copilot chat. Then write: "Follow the procedure and prompt for Step [ID] in the attached workbook. My inputs follow." Paste your inputs.</w:t>
+      </w:r>
+    </w:p>
+    <w:p>
+      <w:pPr>
+        <w:pStyle w:val="Heading1"/>
+      </w:pPr>
+      <w:r>
+        <w:rPr>
+          <w:color w:val="0F2744"/>
+        </w:rPr>
+        <w:t>Session state header — paste at the top of every prompt</w:t>
+      </w:r>
+    </w:p>
+    <w:p>
+      <w:r>
+        <w:rPr>
+          <w:b w:val="0"/>
+          <w:i w:val="0"/>
+        </w:rPr>
+        <w:t>Copilot has no memory of your process. Without this header, it repeats completed work, proposes steps you have done, and does not ask for the information that would improve the output. Fill the brackets and paste this block above each step prompt:</w:t>
+      </w:r>
+    </w:p>
+    <w:tbl>
+      <w:tblPr>
+        <w:tblStyle w:val="TableGrid"/>
+        <w:tblW w:type="auto" w:w="0"/>
+        <w:tblLook w:firstColumn="1" w:firstRow="1" w:lastColumn="0" w:lastRow="0" w:noHBand="0" w:noVBand="1" w:val="04A0"/>
+      </w:tblPr>
+      <w:tblGrid>
+        <w:gridCol w:w="8640"/>
+      </w:tblGrid>
+      <w:tr>
+        <w:tc>
+          <w:tcPr>
+            <w:tcW w:type="dxa" w:w="8640"/>
+            <w:shd w:fill="F0EBFB"/>
+          </w:tcPr>
+          <w:p>
+            <w:r>
+              <w:rPr>
+                <w:b/>
+                <w:color w:val="5B21B6"/>
+                <w:sz w:val="18"/>
+              </w:rPr>
+              <w:t>PROMPT FOR COPILOT — copy the full block below into Copilot chat</w:t>
+            </w:r>
+          </w:p>
+          <w:p>
+            <w:r>
+              <w:rPr>
+                <w:rFonts w:ascii="Consolas" w:hAnsi="Consolas" w:eastAsia="Consolas"/>
+                <w:sz w:val="17"/>
+              </w:rPr>
+              <w:t>SESSION STATE</w:t>
+              <w:br/>
+              <w:t>Completed steps: [example: A1-A5, B1-B3]</w:t>
+              <w:br/>
+              <w:t>Current step: [example: B4]</w:t>
+              <w:br/>
+              <w:t>Approved outputs attached below: [list them]</w:t>
+              <w:br/>
+              <w:br/>
+              <w:t>Rules for this session:</w:t>
+              <w:br/>
+              <w:t>1. Do not repeat or redo work from the completed steps. Their outputs are final unless I ask for a change.</w:t>
+              <w:br/>
+              <w:t>2. Do not propose next steps or a plan. The workbook sets the sequence. Do only the current step.</w:t>
+              <w:br/>
+              <w:t>3. BEFORE you produce the output: if information is missing that would make the output materially better, ask me numbered questions first and stop. If you have enough, say "no questions" and produce the output.</w:t>
+              <w:br/>
+              <w:t>4. If an instruction in this prompt conflicts with something you assume, follow the prompt and flag the conflict.</w:t>
+            </w:r>
+          </w:p>
+        </w:tc>
+      </w:tr>
+    </w:tbl>
+    <w:p/>
+    <w:p>
+      <w:r>
+        <w:rPr>
+          <w:b w:val="0"/>
+          <w:i w:val="0"/>
+        </w:rPr>
+        <w:t>Rule 3 is the important one. It changes Copilot from a passive producer into an active interviewer: it must ask for the missing budget figure, the missing attendee name, or the missing data source before it writes — instead of inventing around the gap.</w:t>
+      </w:r>
+    </w:p>
+    <w:p>
+      <w:pPr>
+        <w:pStyle w:val="Heading1"/>
+      </w:pPr>
+      <w:r>
+        <w:rPr>
+          <w:color w:val="0F2744"/>
+        </w:rPr>
+        <w:t>Verification protocol — three checks catch the errors</w:t>
+      </w:r>
+    </w:p>
+    <w:p>
+      <w:r>
+        <w:rPr>
+          <w:b/>
+          <w:i w:val="0"/>
+        </w:rPr>
+        <w:t>1. Self-check — same chat. Add this line to the end of each prompt:</w:t>
+      </w:r>
+    </w:p>
+    <w:tbl>
+      <w:tblPr>
+        <w:tblStyle w:val="TableGrid"/>
+        <w:tblW w:type="auto" w:w="0"/>
+        <w:tblLook w:firstColumn="1" w:firstRow="1" w:lastColumn="0" w:lastRow="0" w:noHBand="0" w:noVBand="1" w:val="04A0"/>
+      </w:tblPr>
+      <w:tblGrid>
+        <w:gridCol w:w="8640"/>
+      </w:tblGrid>
+      <w:tr>
+        <w:tc>
+          <w:tcPr>
+            <w:tcW w:type="dxa" w:w="8640"/>
+            <w:shd w:fill="F0EBFB"/>
+          </w:tcPr>
+          <w:p>
+            <w:r>
+              <w:rPr>
+                <w:b/>
+                <w:color w:val="5B21B6"/>
+                <w:sz w:val="18"/>
+              </w:rPr>
+              <w:t>PROMPT FOR COPILOT — copy the full block below into Copilot chat</w:t>
+            </w:r>
+          </w:p>
+          <w:p>
+            <w:r>
+              <w:rPr>
+                <w:rFonts w:ascii="Consolas" w:hAnsi="Consolas" w:eastAsia="Consolas"/>
+                <w:sz w:val="17"/>
+              </w:rPr>
+              <w:t>Before you give the output: test your work against each rule in this prompt. Add a table at the end: rule | PASS or FAIL | repair made. Repair each FAIL before you give the output.</w:t>
+            </w:r>
+          </w:p>
+        </w:tc>
+      </w:tr>
+    </w:tbl>
+    <w:p/>
+    <w:p>
+      <w:r>
+        <w:rPr>
+          <w:b/>
+          <w:i w:val="0"/>
+        </w:rPr>
+        <w:t>2. Independent check — new chat. The producer must not be the only checker of its own work. For the heavy gates (B4 pyramid, B8 lint, B11 deck), open a NEW Copilot chat with no history. Paste this verifier prompt, with the output and the step checklist:</w:t>
+      </w:r>
+    </w:p>
+    <w:tbl>
+      <w:tblPr>
+        <w:tblStyle w:val="TableGrid"/>
+        <w:tblW w:type="auto" w:w="0"/>
+        <w:tblLook w:firstColumn="1" w:firstRow="1" w:lastColumn="0" w:lastRow="0" w:noHBand="0" w:noVBand="1" w:val="04A0"/>
+      </w:tblPr>
+      <w:tblGrid>
+        <w:gridCol w:w="8640"/>
+      </w:tblGrid>
+      <w:tr>
+        <w:tc>
+          <w:tcPr>
+            <w:tcW w:type="dxa" w:w="8640"/>
+            <w:shd w:fill="F0EBFB"/>
+          </w:tcPr>
+          <w:p>
+            <w:r>
+              <w:rPr>
+                <w:b/>
+                <w:color w:val="5B21B6"/>
+                <w:sz w:val="18"/>
+              </w:rPr>
+              <w:t>PROMPT FOR COPILOT — copy the full block below into Copilot chat</w:t>
+            </w:r>
+          </w:p>
+          <w:p>
+            <w:r>
+              <w:rPr>
+                <w:rFonts w:ascii="Consolas" w:hAnsi="Consolas" w:eastAsia="Consolas"/>
+                <w:sz w:val="17"/>
+              </w:rPr>
+              <w:t>You are a verifier. You did not make this work. Your task is to find defects. Do not repair them.</w:t>
+              <w:br/>
+              <w:br/>
+              <w:t>Work product: [PASTE the output]</w:t>
+              <w:br/>
+              <w:t>Rules: [PASTE the step's review checklist and gate]</w:t>
+              <w:br/>
+              <w:br/>
+              <w:t>Do this:</w:t>
+              <w:br/>
+              <w:t>1. Test the product against each rule. Try to make each rule fail.</w:t>
+              <w:br/>
+              <w:t>2. Quote the exact text of each failure.</w:t>
+              <w:br/>
+              <w:t>3. Do not accept a claim without evidence inside the product.</w:t>
+              <w:br/>
+              <w:t>4. Output a table: rule | PASS or FAIL | exact quote | proposed repair.</w:t>
+              <w:br/>
+              <w:t>5. End with one verdict: ACCEPT or RETURN FOR REPAIR.</w:t>
+            </w:r>
+          </w:p>
+        </w:tc>
+      </w:tr>
+    </w:tbl>
+    <w:p/>
+    <w:p>
+      <w:r>
+        <w:rPr>
+          <w:b/>
+          <w:i w:val="0"/>
+        </w:rPr>
+        <w:t>3. Human checks — only you can do these. Copilot cannot see the rendered page, and it cannot know if your data is true. You must check: the deck in the browser (B11 has a built-in check on the 'q' key), five numbers against the evidence register, and the match between the simulated room and the real persons.</w:t>
       </w:r>
     </w:p>
     <w:p>
@@ -7527,9 +7743,11 @@
               <w:br/>
               <w:t>.slide.active{display:flex;}</w:t>
               <w:br/>
-              <w:t>.slide h1{font-size:26px;line-height:1.3;max-width:960px;margin-bottom:24px;}</w:t>
+              <w:t>.slide h1{font-size:26px;line-height:1.3;max-width:1000px;margin-bottom:16px;}</w:t>
               <w:br/>
               <w:t>.exhibit{flex:1;display:flex;align-items:center;justify-content:center;}</w:t>
+              <w:br/>
+              <w:t>.exhibit&gt;*{width:100%;max-width:1000px;}</w:t>
               <w:br/>
               <w:t>.source{font-size:11px;color:var(--muted);border-top:1px solid var(--border);padding-top:8px;}</w:t>
               <w:br/>
@@ -7541,15 +7759,23 @@
               <w:br/>
               <w:t>.nav button{padding:6px 14px;border:1px solid var(--border);background:var(--surface);cursor:pointer;}</w:t>
               <w:br/>
-              <w:t>.bar-row{display:flex;align-items:center;gap:12px;margin:10px 0;font-size:14px;}</w:t>
+              <w:t>.bar-row{display:flex;align-items:center;gap:12px;margin:14px 0;font-size:18px;}</w:t>
               <w:br/>
-              <w:t>.bar-row .label{width:180px;text-align:right;}</w:t>
+              <w:t>.bar-row .label{width:240px;text-align:right;}</w:t>
               <w:br/>
-              <w:t>.bar-row .bar{height:26px;background:var(--grey);}</w:t>
+              <w:t>.bar-row .bar{height:40px;background:var(--grey);}</w:t>
               <w:br/>
               <w:t>.bar-row .bar.hl{background:var(--accent);}</w:t>
               <w:br/>
               <w:t>.bar-row .val{font-weight:600;}</w:t>
+              <w:br/>
+              <w:t>table.x{border-collapse:collapse;font-size:18px;width:100%;}</w:t>
+              <w:br/>
+              <w:t>table.x th,table.x td{border-bottom:1px solid var(--border);padding:12px 16px;text-align:left;}</w:t>
+              <w:br/>
+              <w:t>table.x th{border-bottom:2px solid var(--grey);}</w:t>
+              <w:br/>
+              <w:t>#qa{display:none;position:fixed;top:16px;left:16px;right:16px;background:#fff8e6;border:2px solid #d4820a;padding:16px;font-size:13px;z-index:9;max-height:70vh;overflow:auto;white-space:pre-line;}</w:t>
               <w:br/>
               <w:t>&lt;/style&gt;&lt;/head&gt;&lt;body&gt;</w:t>
               <w:br/>
@@ -7569,6 +7795,8 @@
               <w:t>&lt;!-- more slides --&gt;</w:t>
               <w:br/>
               <w:br/>
+              <w:t>&lt;div id="qa"&gt;&lt;/div&gt;</w:t>
+              <w:br/>
               <w:t>&lt;div class="nav"&gt;</w:t>
               <w:br/>
               <w:t xml:space="preserve">  &lt;button onclick="mv(-1)"&gt;&amp;larr;&lt;/button&gt;</w:t>
@@ -7587,11 +7815,58 @@
               <w:br/>
               <w:t>function mv(d){show(i+d);}</w:t>
               <w:br/>
-              <w:t>document.addEventListener('keydown',function(e){if(e.key==='ArrowRight')mv(1);if(e.key==='ArrowLeft')mv(-1);if(e.key==='n')s[i].querySelector('.notes').classList.toggle('show');});</w:t>
+              <w:t>function qa(){var out=[],k=i,j,sl,n,h,lh,ex,r,c,so;</w:t>
+              <w:br/>
+              <w:t>for(j=0;j!=s.length;j++){show(j);sl=s[j];n=j+1;</w:t>
+              <w:br/>
+              <w:t>h=sl.querySelector('h1');</w:t>
+              <w:br/>
+              <w:t>if(!h||!h.textContent.trim()){out.push('Slide '+n+': no title');}</w:t>
+              <w:br/>
+              <w:t>else{lh=parseFloat(getComputedStyle(h).lineHeight);</w:t>
+              <w:br/>
+              <w:t>if(h.getBoundingClientRect().height&gt;2.3*lh)out.push('Slide '+n+': title is more than 2 lines');}</w:t>
+              <w:br/>
+              <w:t>ex=sl.querySelector('.exhibit');</w:t>
+              <w:br/>
+              <w:t>if(!ex||!ex.firstElementChild){out.push('Slide '+n+': empty exhibit');}</w:t>
+              <w:br/>
+              <w:t>else{r=ex.getBoundingClientRect();c=ex.firstElementChild.getBoundingClientRect();</w:t>
+              <w:br/>
+              <w:t>if(r.height&gt;0&amp;&amp;0.4*r.height&gt;c.height)out.push('Slide '+n+': exhibit uses under 40% of its space — make it larger');}</w:t>
+              <w:br/>
+              <w:t>so=sl.querySelector('.source');</w:t>
+              <w:br/>
+              <w:t>if(!so||5&gt;so.textContent.replace('Source:','').trim().length)out.push('Slide '+n+': no source line');</w:t>
+              <w:br/>
+              <w:t>if(!sl.querySelector('.notes')||!sl.querySelector('.notes').textContent.trim())out.push('Slide '+n+': no speaker notes');}</w:t>
+              <w:br/>
+              <w:t>show(k);var q=document.getElementById('qa');</w:t>
+              <w:br/>
+              <w:t>q.textContent='QA CHECK — '+s.length+' slides\n'+(out.length?out.join('\n'):'All checks PASS');</w:t>
+              <w:br/>
+              <w:t>q.style.display=q.style.display==='block'?'none':'block';}</w:t>
+              <w:br/>
+              <w:t>document.addEventListener('keydown',function(e){</w:t>
+              <w:br/>
+              <w:t>if(e.key==='ArrowRight')mv(1);</w:t>
+              <w:br/>
+              <w:t>if(e.key==='ArrowLeft')mv(-1);</w:t>
+              <w:br/>
+              <w:t>if(e.key==='n')s[i].querySelector('.notes').classList.toggle('show');</w:t>
+              <w:br/>
+              <w:t>if(e.key==='q')qa();});</w:t>
               <w:br/>
               <w:t>show(0);</w:t>
               <w:br/>
               <w:t>&lt;/script&gt;&lt;/body&gt;&lt;/html&gt;</w:t>
+              <w:br/>
+              <w:br/>
+              <w:t>8. Make each exhibit fill its space. The exhibit content must use more than 40% of the height of its area. Bar charts: 40px bars, 18px labels. Tables: use class "x". If a slide shows a large empty area, the exhibit is too small. Make it larger.</w:t>
+              <w:br/>
+              <w:t>9. Keep the QA script. It runs on the 'q' key and checks each slide: title present and 2 lines maximum, exhibit present and large, source line present, speaker notes present.</w:t>
+              <w:br/>
+              <w:t>10. Before you give the output: test your work against rules 1-9. Add a table at the end: rule | PASS or FAIL | repair made. Repair each FAIL before you give the output.</w:t>
               <w:br/>
               <w:br/>
               <w:t>Output: the complete file in one code block. If the output is cut, continue in a second code block from the exact cut point.</w:t>
@@ -7658,6 +7933,14 @@
               <w:t>4. Open the file in Edge. Use the arrow keys to move. Use the 'n' key for the notes.</w:t>
             </w:r>
           </w:p>
+          <w:p>
+            <w:r>
+              <w:rPr>
+                <w:sz w:val="20"/>
+              </w:rPr>
+              <w:t>5. Press 'q'. The built-in QA check tests each slide and lists the failures with slide numbers.</w:t>
+            </w:r>
+          </w:p>
         </w:tc>
       </w:tr>
     </w:tbl>
@@ -7684,7 +7967,7 @@
                 <w:color w:val="D4820A"/>
                 <w:sz w:val="18"/>
               </w:rPr>
-              <w:t>YOUR REVIEW CHECKLIST</w:t>
+              <w:t>YOUR REVIEW CHECKLIST — DO THE CHECKS IN THIS ORDER</w:t>
             </w:r>
           </w:p>
           <w:p>
@@ -7692,7 +7975,7 @@
               <w:rPr>
                 <w:sz w:val="20"/>
               </w:rPr>
-              <w:t>✓ The file opens and all slides show. The counter shows the correct total.</w:t>
+              <w:t>✓ Machine check first: press 'q'. The QA overlay must show "All checks PASS". If it lists failures, send them back to Copilot word for word: "Repair these QA failures: [paste]". Repeat until PASS.</w:t>
             </w:r>
           </w:p>
           <w:p>
@@ -7700,6 +7983,14 @@
               <w:rPr>
                 <w:sz w:val="20"/>
               </w:rPr>
+              <w:t>✓ The file opens and all slides show. The counter shows the correct total from the B10 storyboard.</w:t>
+            </w:r>
+          </w:p>
+          <w:p>
+            <w:r>
+              <w:rPr>
+                <w:sz w:val="20"/>
+              </w:rPr>
               <w:t>✓ Step through the full deck with the titles only. The argument stands. This is the title-read test in the browser.</w:t>
             </w:r>
           </w:p>
@@ -7708,7 +7999,7 @@
               <w:rPr>
                 <w:sz w:val="20"/>
               </w:rPr>
-              <w:t>✓ Each exhibit matches its B6 specification. One message. One highlight in the accent colour.</w:t>
+              <w:t>✓ Each exhibit matches its B6 specification. One message. One highlight in the accent colour. No large empty areas.</w:t>
             </w:r>
           </w:p>
           <w:p>
@@ -7716,7 +8007,7 @@
               <w:rPr>
                 <w:sz w:val="20"/>
               </w:rPr>
-              <w:t>✓ Check five numbers against the evidence register. If one is wrong, check all.</w:t>
+              <w:t>✓ Data check: check five numbers against the evidence register. If one is wrong, check all. Copilot cannot do this check — only you know the true data.</w:t>
             </w:r>
           </w:p>
           <w:p>
@@ -7733,6 +8024,14 @@
                 <w:sz w:val="20"/>
               </w:rPr>
               <w:t>✓ The 'n' key shows the correct notes on each slide.</w:t>
+            </w:r>
+          </w:p>
+          <w:p>
+            <w:r>
+              <w:rPr>
+                <w:sz w:val="20"/>
+              </w:rPr>
+              <w:t>✓ Independent check (optional, for high-stakes decks): new Copilot chat, verifier prompt from the Verification protocol, paste the storyboard + the deck title list. The verifier confirms the deck matches the storyboard.</w:t>
             </w:r>
           </w:p>
         </w:tc>

</xml_diff>

<commit_message>
Slide design rules abstracted from McKinsey reference deck
- 9 rules in B9: action titles as running argument, kicker lines,
  process tracker, label-and-content grammar, bold-only-load-bearing
  words, values-on-bars charts (no axis/grid/legend), quote and
  case-study templates, SOURCE footers, detail signals
- B11 skeleton: kicker element, chart-head/chart-unit, quote card,
  so-what panel; prompt rules renumbered 1-11
</commit_message>
<xml_diff>
--- a/Pyramid_Principle_Workbook.docx
+++ b/Pyramid_Principle_Workbook.docx
@@ -6971,6 +6971,115 @@
         <w:tc>
           <w:tcPr>
             <w:tcW w:type="dxa" w:w="8640"/>
+            <w:shd w:fill="E8EEF8"/>
+          </w:tcPr>
+          <w:p>
+            <w:r>
+              <w:rPr>
+                <w:b/>
+                <w:color w:val="1F4FA8"/>
+                <w:sz w:val="18"/>
+              </w:rPr>
+              <w:t>SLIDE DESIGN RULES — ABSTRACTED FROM A MCKINSEY REFERENCE DECK</w:t>
+            </w:r>
+          </w:p>
+          <w:p>
+            <w:r>
+              <w:rPr>
+                <w:sz w:val="20"/>
+              </w:rPr>
+              <w:t>These rules come from a study of a McKinsey &amp; Company deck (46 pages, 2012). Apply them in the storyboard and in the B11 build.</w:t>
+            </w:r>
+          </w:p>
+          <w:p>
+            <w:r>
+              <w:rPr>
+                <w:sz w:val="20"/>
+              </w:rPr>
+              <w:t>1. Titles. The title is a full-sentence claim in the accent colour, top left, 2 lines maximum. Sentence case. No full stop. Titles connect across slides: a claim can continue from one slide to the next. The title sequence reads as the argument.</w:t>
+            </w:r>
+          </w:p>
+          <w:p>
+            <w:r>
+              <w:rPr>
+                <w:sz w:val="20"/>
+              </w:rPr>
+              <w:t>2. The kicker line. Above each body-slide title, put a small italic grey label with the section name (example: "Diagnosis", "Strategy", "Execution"). When a slide gives the detail of a numbered item from a summary slide, put that number in a blue circle before the title.</w:t>
+            </w:r>
+          </w:p>
+          <w:p>
+            <w:r>
+              <w:rPr>
+                <w:sz w:val="20"/>
+              </w:rPr>
+              <w:t>3. The tracker. In a multi-part section, repeat a small process diagram on each slide (left rail). Show the current stage in dark blue and the other stages in light blue. Repeat the agenda slide at each section break, with the current section in a light highlight bar.</w:t>
+            </w:r>
+          </w:p>
+          <w:p>
+            <w:r>
+              <w:rPr>
+                <w:sz w:val="20"/>
+              </w:rPr>
+              <w:t>4. The label-and-content grammar. Left column: short category labels in light accent boxes (2-4 words). Right column: the content for each label, as bullets. Put a dotted line between label groups. Use numbered circles (1, 2, 3) only for sequences and priorities, not for plain lists.</w:t>
+            </w:r>
+          </w:p>
+          <w:p>
+            <w:r>
+              <w:rPr>
+                <w:sz w:val="20"/>
+              </w:rPr>
+              <w:t>5. Emphasis discipline. Bold ONLY the load-bearing words in each bullet, never full sentences. A reader of only the bold words must get the message. One accent colour family. Reserve a second colour (red) for the few items that matter most: key numbers, results, warnings.</w:t>
+            </w:r>
+          </w:p>
+          <w:p>
+            <w:r>
+              <w:rPr>
+                <w:sz w:val="20"/>
+              </w:rPr>
+              <w:t>6. Charts. Chart header = metric name + period. The unit sits on its own grey line below the header ("Percent"). Put the values on the bars. Remove the y-axis, the gridlines, and the legend. The message bar is dark; the comparison bars are light. Two parallel charts can carry headers that continue one sentence.</w:t>
+            </w:r>
+          </w:p>
+          <w:p>
+            <w:r>
+              <w:rPr>
+                <w:sz w:val="20"/>
+              </w:rPr>
+              <w:t>7. Quotes and cases. Quote card: light tinted background, the key phrase in bold, attribution "- Name, Title, Company". Case-study slides use one fixed template: Opportunity / Best practices / Result labels on the left, logo and screenshot on the right. Put the so-what in a separate right panel titled "What this means for [reader]".</w:t>
+            </w:r>
+          </w:p>
+          <w:p>
+            <w:r>
+              <w:rPr>
+                <w:sz w:val="20"/>
+              </w:rPr>
+              <w:t>8. Footers and sources. Every evidence slide has "SOURCE: ..." at the bottom left. Footnote numbers sit above the footer in small grey text. The slide number sits at the bottom right.</w:t>
+            </w:r>
+          </w:p>
+          <w:p>
+            <w:r>
+              <w:rPr>
+                <w:sz w:val="20"/>
+              </w:rPr>
+              <w:t>9. Detail signals. Mark an item that gets detail later with a dashed outline and a "Details follow" legend. Mark appendix detail with "Details in appendix".</w:t>
+            </w:r>
+          </w:p>
+        </w:tc>
+      </w:tr>
+    </w:tbl>
+    <w:p/>
+    <w:tbl>
+      <w:tblPr>
+        <w:tblStyle w:val="TableGrid"/>
+        <w:tblW w:type="auto" w:w="0"/>
+        <w:tblLook w:firstColumn="1" w:firstRow="1" w:lastColumn="0" w:lastRow="0" w:noHBand="0" w:noVBand="1" w:val="04A0"/>
+      </w:tblPr>
+      <w:tblGrid>
+        <w:gridCol w:w="8640"/>
+      </w:tblGrid>
+      <w:tr>
+        <w:tc>
+          <w:tcPr>
+            <w:tcW w:type="dxa" w:w="8640"/>
             <w:shd w:fill="FFF8E6"/>
           </w:tcPr>
           <w:p>
@@ -7021,6 +7130,14 @@
                 <w:sz w:val="20"/>
               </w:rPr>
               <w:t>✓ The slide count fits the time budget, with space for interruptions.</w:t>
+            </w:r>
+          </w:p>
+          <w:p>
+            <w:r>
+              <w:rPr>
+                <w:sz w:val="20"/>
+              </w:rPr>
+              <w:t>✓ The design rules are applied: kicker lines, bold-only-key-words, values on bars, sources on evidence slides.</w:t>
             </w:r>
           </w:p>
         </w:tc>
@@ -7743,7 +7860,19 @@
               <w:br/>
               <w:t>.slide.active{display:flex;}</w:t>
               <w:br/>
-              <w:t>.slide h1{font-size:26px;line-height:1.3;max-width:1000px;margin-bottom:16px;}</w:t>
+              <w:t>.kicker{font-size:13px;color:var(--muted);font-style:italic;}</w:t>
+              <w:br/>
+              <w:t>.slide h1{font-size:26px;line-height:1.3;max-width:1000px;margin-bottom:16px;color:var(--accent);}</w:t>
+              <w:br/>
+              <w:t>.chart-head{font-weight:600;font-size:16px;}</w:t>
+              <w:br/>
+              <w:t>.chart-unit{font-size:13px;color:var(--muted);border-bottom:1px solid var(--border);margin-bottom:12px;padding-bottom:4px;}</w:t>
+              <w:br/>
+              <w:t>.quote{background:#e6f4ec;padding:14px 18px;font-size:16px;margin:10px 0;}</w:t>
+              <w:br/>
+              <w:t>.quote .attr{font-size:13px;color:var(--muted);}</w:t>
+              <w:br/>
+              <w:t>.sowhat{border:1px solid var(--accent);background:#e8eef8;padding:14px;font-size:15px;}</w:t>
               <w:br/>
               <w:t>.exhibit{flex:1;display:flex;align-items:center;justify-content:center;}</w:t>
               <w:br/>
@@ -7782,11 +7911,13 @@
               <w:br/>
               <w:t>&lt;section class="slide active"&gt;</w:t>
               <w:br/>
+              <w:t xml:space="preserve">  &lt;div class="kicker"&gt;[SECTION NAME]&lt;/div&gt;</w:t>
+              <w:br/>
               <w:t xml:space="preserve">  &lt;h1&gt;[CLAIM TITLE]&lt;/h1&gt;</w:t>
               <w:br/>
               <w:t xml:space="preserve">  &lt;div class="exhibit"&gt;[EXHIBIT]&lt;/div&gt;</w:t>
               <w:br/>
-              <w:t xml:space="preserve">  &lt;div class="source"&gt;Source: [..]&lt;/div&gt;</w:t>
+              <w:t xml:space="preserve">  &lt;div class="source"&gt;SOURCE: [..]&lt;/div&gt;</w:t>
               <w:br/>
               <w:t xml:space="preserve">  &lt;div class="notes"&gt;[SPEAKER NOTES]&lt;/div&gt;</w:t>
               <w:br/>
@@ -7862,11 +7993,23 @@
               <w:t>&lt;/script&gt;&lt;/body&gt;&lt;/html&gt;</w:t>
               <w:br/>
               <w:br/>
-              <w:t>8. Make each exhibit fill its space. The exhibit content must use more than 40% of the height of its area. Bar charts: 40px bars, 18px labels. Tables: use class "x". If a slide shows a large empty area, the exhibit is too small. Make it larger.</w:t>
-              <w:br/>
-              <w:t>9. Keep the QA script. It runs on the 'q' key and checks each slide: title present and 2 lines maximum, exhibit present and large, source line present, speaker notes present.</w:t>
-              <w:br/>
-              <w:t>10. Before you give the output: test your work against rules 1-9. Add a table at the end: rule | PASS or FAIL | repair made. Repair each FAIL before you give the output.</w:t>
+              <w:t>8. Apply the slide design rules:</w:t>
+              <w:br/>
+              <w:t xml:space="preserve">   a. Each body slide has a kicker line: the section name in small italic grey, above the title.</w:t>
+              <w:br/>
+              <w:t xml:space="preserve">   b. Bold ONLY the load-bearing words in bullets, never full sentences. A reader of only the bold words must get the message.</w:t>
+              <w:br/>
+              <w:t xml:space="preserve">   c. Chart slides: header = metric name + period (class "chart-head"), the unit on its own grey line (class "chart-unit"). Values on the bars. No axis, no gridlines, no legend. Message bar dark (hl class), comparison bars grey.</w:t>
+              <w:br/>
+              <w:t xml:space="preserve">   d. Quotes: class "quote", key phrase in bold, attribution "- Name, Title, Company" in class "attr".</w:t>
+              <w:br/>
+              <w:t xml:space="preserve">   e. If a slide needs a so-what next to the evidence, put it in a panel with class "sowhat" titled "What this means for [reader]".</w:t>
+              <w:br/>
+              <w:t>9. Make each exhibit fill its space. The exhibit content must use more than 40% of the height of its area. Bar charts: 40px bars, 18px labels. Tables: use class "x". If a slide shows a large empty area, the exhibit is too small. Make it larger.</w:t>
+              <w:br/>
+              <w:t>10. Keep the QA script. It runs on the 'q' key and checks each slide: title present and 2 lines maximum, exhibit present and large, source line present, speaker notes present.</w:t>
+              <w:br/>
+              <w:t>11. Before you give the output: test your work against rules 1-10. Add a table at the end: rule | PASS or FAIL | repair made. Repair each FAIL before you give the output.</w:t>
               <w:br/>
               <w:br/>
               <w:t>Output: the complete file in one code block. If the output is cut, continue in a second code block from the exact cut point.</w:t>

</xml_diff>

<commit_message>
Standalone slides become the default mode; live pitch is the marked variant
- B9: standalone rule box (Minto's 90/10 assumes a speaker; corporate
  decks travel alone), sequence gains exec summary + agenda repeats,
  body forms (exhibit+bullets / label rows / quotes / case template),
  self-sufficiency test, live-pitch as explicit exception
- B11: skeleton gains summary/agenda/label-row classes, LIVE flag,
  QA notes check conditional on live mode; standalone rules in prompt
</commit_message>
<xml_diff>
--- a/Pyramid_Principle_Workbook.docx
+++ b/Pyramid_Principle_Workbook.docx
@@ -6793,7 +6793,7 @@
           <w:i/>
           <w:color w:val="718096"/>
         </w:rPr>
-        <w:t>Write the title sequence first. Then attach the exhibits. Never in the other direction.</w:t>
+        <w:t>Write the title sequence first. Build slides that stand alone without a speaker.</w:t>
       </w:r>
     </w:p>
     <w:p>
@@ -6810,7 +6810,7 @@
           <w:color w:val="718096"/>
           <w:sz w:val="18"/>
         </w:rPr>
-        <w:t xml:space="preserve">narrative after lint (B8) + exhibit specifications (B6)   </w:t>
+        <w:t xml:space="preserve">narrative after lint (B8) + exhibit specifications (B6) + presence mode (B2)   </w:t>
       </w:r>
       <w:r>
         <w:rPr>
@@ -6828,6 +6828,59 @@
         <w:t>storyboard, slide by slide, with the anatomy of each slide</w:t>
       </w:r>
     </w:p>
+    <w:tbl>
+      <w:tblPr>
+        <w:tblStyle w:val="TableGrid"/>
+        <w:tblW w:type="auto" w:w="0"/>
+        <w:tblLook w:firstColumn="1" w:firstRow="1" w:lastColumn="0" w:lastRow="0" w:noHBand="0" w:noVBand="1" w:val="04A0"/>
+      </w:tblPr>
+      <w:tblGrid>
+        <w:gridCol w:w="8640"/>
+      </w:tblGrid>
+      <w:tr>
+        <w:tc>
+          <w:tcPr>
+            <w:tcW w:type="dxa" w:w="8640"/>
+            <w:shd w:fill="FDE8E8"/>
+          </w:tcPr>
+          <w:p>
+            <w:r>
+              <w:rPr>
+                <w:b/>
+                <w:color w:val="991B1B"/>
+                <w:sz w:val="18"/>
+              </w:rPr>
+              <w:t>STANDALONE IS THE DEFAULT MODE</w:t>
+            </w:r>
+          </w:p>
+          <w:p>
+            <w:r>
+              <w:rPr>
+                <w:sz w:val="20"/>
+              </w:rPr>
+              <w:t>Minto's slide advice assumes a speaker in the room: minimal text, the voice carries the explanation. Most corporate decks do not work that way. They travel by email and SharePoint, and nobody speaks over them.</w:t>
+            </w:r>
+          </w:p>
+          <w:p>
+            <w:r>
+              <w:rPr>
+                <w:sz w:val="20"/>
+              </w:rPr>
+              <w:t>This process builds STANDALONE slides by default: each slide must carry its full message to a cold reader with no presenter. The compression tool is emphasis discipline (bold the load-bearing words), not text deletion.</w:t>
+            </w:r>
+          </w:p>
+          <w:p>
+            <w:r>
+              <w:rPr>
+                <w:sz w:val="20"/>
+              </w:rPr>
+              <w:t>Use the live-pitch variant (minimal text, notes carry the explanation) only when you will present in the room AND the deck will not travel alone. The presence type from B2 decides the mode.</w:t>
+            </w:r>
+          </w:p>
+        </w:tc>
+      </w:tr>
+    </w:tbl>
+    <w:p/>
     <w:p>
       <w:pPr>
         <w:pStyle w:val="Heading3"/>
@@ -6844,7 +6897,7 @@
         <w:pStyle w:val="ListNumber"/>
       </w:pPr>
       <w:r>
-        <w:t>Write the dot-dash sequence first. Before you design a slide, write the title sequence alone: one claim on each line, in order. Read it aloud. This sequence IS the presentation. The slides only give the evidence. If the sequence has a gap or a jump, repair it here, at zero cost.</w:t>
+        <w:t>Write the dot-dash sequence first. Before you design a slide, write the title sequence alone: one claim on each line, in order. Read it aloud. This sequence IS the document. The slide bodies prove it. If the sequence has a gap or a jump, repair it here, at zero cost.</w:t>
       </w:r>
     </w:p>
     <w:p>
@@ -6852,7 +6905,7 @@
         <w:pStyle w:val="ListNumber"/>
       </w:pPr>
       <w:r>
-        <w:t>Standard sequence for a Recommendation deck: cover -&gt; Governing Thought -&gt; context (Situation) -&gt; Complication -&gt; key-line 1 (1 intro + 1-3 exhibit slides) -&gt; transition -&gt; key-line 2 (same) -&gt; key-line 3 (same) -&gt; conclusion and assumption -&gt; the ask with its gate. Target: a 20-minute pitch has 12 to 16 slides.</w:t>
+        <w:t>Standard sequence for a standalone Recommendation deck: cover -&gt; executive summary (the SCQA in full prose, one slide) -&gt; agenda -&gt; context (Situation) -&gt; Complication -&gt; key-line 1 section (1 summary slide + 1-3 evidence slides) -&gt; agenda repeat (next section highlighted) -&gt; key-line 2 section -&gt; key-line 3 section -&gt; conclusion and key assumption -&gt; the ask with its gate. A standalone read deck can run longer than a pitch deck — completeness beats brevity.</w:t>
       </w:r>
     </w:p>
     <w:p>
@@ -6860,7 +6913,7 @@
         <w:pStyle w:val="ListNumber"/>
       </w:pPr>
       <w:r>
-        <w:t>Build each slide to the standard anatomy. Title zone: the claim, 2 lines maximum. The only element the reader MUST read. Exhibit zone: about 90% of the body — the exhibit from its B6 specification, with its one highlight. Source line: at the bottom, small: source, date, n=, units.</w:t>
+        <w:t>Build each slide to the standalone anatomy. Kicker: the section name, small italic grey. Title zone: the claim, 2 lines maximum. Body: the proof of the claim, complete in itself. Four body forms: (a) exhibit with short framing bullets, (b) label-and-content rows (category labels left, bullets right), (c) quote cards, (d) the case template (Opportunity / Best practices / Result). The body must answer the title claim with no voice-over. Source line at the bottom: SOURCE, date range, n=, units.</w:t>
       </w:r>
     </w:p>
     <w:p>
@@ -6868,7 +6921,7 @@
         <w:pStyle w:val="ListNumber"/>
       </w:pPr>
       <w:r>
-        <w:t>Apply the slide discipline: one slide = one claim = one exhibit. A slide that needs two exhibits is two slides. A title with "and" between claims is two slides.</w:t>
+        <w:t>Apply the slide discipline: one slide = one claim = one body. A slide that needs two messages is two slides. A title with "and" between claims is two slides.</w:t>
       </w:r>
     </w:p>
     <w:p>
@@ -6876,7 +6929,7 @@
         <w:pStyle w:val="ListNumber"/>
       </w:pPr>
       <w:r>
-        <w:t>Move all explanation to the speaker notes. Bullet text on a slide competes with the exhibit. The exhibit must win.</w:t>
+        <w:t>Make each slide self-sufficient. A cold reader with no presenter must get the full message from the slide alone. Compress with emphasis discipline: bold only the load-bearing words, so the bold words alone carry the message. Do not compress by moving required content to the notes — for a standalone deck, the notes hold only extra colour, never required content.</w:t>
       </w:r>
     </w:p>
     <w:p>
@@ -6885,6 +6938,14 @@
       </w:pPr>
       <w:r>
         <w:t>Design the two text-only slides with care. The Governing Thought slide: large type, clean background, nothing else. The ask slide: the decision, the gate, the date — nothing else.</w:t>
+      </w:r>
+    </w:p>
+    <w:p>
+      <w:pPr>
+        <w:pStyle w:val="ListNumber"/>
+      </w:pPr>
+      <w:r>
+        <w:t>Live-pitch variant (exception): if B2 says you present in the room and the deck does not travel, strip the body to the exhibit and move the explanation to the speaker notes. Say so explicitly in the B11 build.</w:t>
       </w:r>
     </w:p>
     <w:p>
@@ -6933,25 +6994,27 @@
               <w:br/>
               <w:t>Exhibit specification sheet: [PASTE from B6]</w:t>
               <w:br/>
-              <w:t>Time budget: [X minutes]</w:t>
+              <w:t>Mode from B2: [STANDALONE (default) or LIVE PITCH]</w:t>
               <w:br/>
               <w:br/>
               <w:t>Do this:</w:t>
               <w:br/>
               <w:t>1. DOT-DASH FIRST: write the title sequence alone — one claim for each slide, in order. Read it as an argument that stands alone. Repair the gaps before you design a slide.</w:t>
               <w:br/>
-              <w:t>2. Build the storyboard table: slide # | claim title | exhibit (from the specification ID) + its highlight | source line | speaker notes.</w:t>
-              <w:br/>
-              <w:t>3. Anatomy for each slide: title 2 lines maximum; exhibit about 90% of the body; source line. One slide = one claim = one exhibit. Divide each slide that breaks this rule.</w:t>
-              <w:br/>
-              <w:t>4. Two text-only slides: the Governing Thought (large type, alone) and the ask with its gate (decision + gate + date, alone).</w:t>
-              <w:br/>
-              <w:t>5. Slide count check: a [X]-minute pitch has about [X*0.7] slides maximum.</w:t>
+              <w:t>2. Sequence for a STANDALONE deck: cover, executive summary (the SCQA in full prose), agenda, context, complication, then one section per key-line (1 summary slide + 1-3 evidence slides, agenda repeated between sections), conclusion + key assumption, the ask with its gate.</w:t>
+              <w:br/>
+              <w:t>3. Build the storyboard table: slide # | kicker (section) | claim title | body plan (exhibit ID + framing bullets, label rows, quotes, or case template) | source line | notes (extra colour only, never required content).</w:t>
+              <w:br/>
+              <w:t>4. STANDALONE rule: each slide's body must carry the full message to a cold reader with no presenter. Compress with bold on the load-bearing words only — never by moving required content to the notes. One slide = one claim = one body. Divide each slide that breaks this rule. (LIVE PITCH variant only: strip bodies to the exhibit, move explanation to notes, 12-16 slides for 20 minutes.)</w:t>
+              <w:br/>
+              <w:t>5. Two text-only slides: the Governing Thought (large type, alone) and the ask with its gate (decision + gate + date, alone).</w:t>
               <w:br/>
               <w:t>6. Do the title-read test on the finished sequence. Output the result word for word.</w:t>
               <w:br/>
-              <w:br/>
-              <w:t>Output: dot-dash sequence, storyboard table, title-read test result.</w:t>
+              <w:t>7. Self-sufficiency test: for three slides chosen at random, write what a cold reader learns from the slide alone. If the reader misses part of the message, repair the body.</w:t>
+              <w:br/>
+              <w:br/>
+              <w:t>Output: dot-dash sequence, storyboard table, title-read result, self-sufficiency test result.</w:t>
             </w:r>
           </w:p>
         </w:tc>
@@ -7105,7 +7168,7 @@
               <w:rPr>
                 <w:sz w:val="20"/>
               </w:rPr>
-              <w:t>✓ Each slide: one claim, one exhibit, one highlight.</w:t>
+              <w:t>✓ The standalone test: open three slides at random. A cold reader with no presenter must get the full message from the slide alone.</w:t>
             </w:r>
           </w:p>
           <w:p>
@@ -7113,7 +7176,7 @@
               <w:rPr>
                 <w:sz w:val="20"/>
               </w:rPr>
-              <w:t>✓ No bullet-text slides in the body. Text goes in the speaker notes.</w:t>
+              <w:t>✓ Each slide: one claim, one body, one highlight.</w:t>
             </w:r>
           </w:p>
           <w:p>
@@ -7121,6 +7184,22 @@
               <w:rPr>
                 <w:sz w:val="20"/>
               </w:rPr>
+              <w:t>✓ Emphasis discipline: bold key words only, never full sentences. Read only the bold words — the message must survive.</w:t>
+            </w:r>
+          </w:p>
+          <w:p>
+            <w:r>
+              <w:rPr>
+                <w:sz w:val="20"/>
+              </w:rPr>
+              <w:t>✓ The executive summary slide carries the full SCQA in prose. The agenda repeats at section breaks.</w:t>
+            </w:r>
+          </w:p>
+          <w:p>
+            <w:r>
+              <w:rPr>
+                <w:sz w:val="20"/>
+              </w:rPr>
               <w:t>✓ The Governing Thought slide and the ask slide are clean text-only slides.</w:t>
             </w:r>
           </w:p>
@@ -7129,15 +7208,7 @@
               <w:rPr>
                 <w:sz w:val="20"/>
               </w:rPr>
-              <w:t>✓ The slide count fits the time budget, with space for interruptions.</w:t>
-            </w:r>
-          </w:p>
-          <w:p>
-            <w:r>
-              <w:rPr>
-                <w:sz w:val="20"/>
-              </w:rPr>
-              <w:t>✓ The design rules are applied: kicker lines, bold-only-key-words, values on bars, sources on evidence slides.</w:t>
+              <w:t>✓ The design rules are applied: kicker lines, values on bars, sources on evidence slides.</w:t>
             </w:r>
           </w:p>
         </w:tc>
@@ -7697,7 +7768,15 @@
               <w:rPr>
                 <w:sz w:val="20"/>
               </w:rPr>
-              <w:t>One slide = one claim = one exhibit, from the B10 storyboard. Do not add slides. Do not remove slides.</w:t>
+              <w:t>One slide = one claim = one body, from the B10 storyboard. Do not add slides. Do not remove slides.</w:t>
+            </w:r>
+          </w:p>
+          <w:p>
+            <w:r>
+              <w:rPr>
+                <w:sz w:val="20"/>
+              </w:rPr>
+              <w:t>Standalone by default: each slide carries its full message to a reader with no presenter. The notes hold extra colour only, never required content.</w:t>
             </w:r>
           </w:p>
         </w:tc>
@@ -7829,15 +7908,15 @@
               <w:br/>
               <w:t>1. No external libraries, fonts, images, or scripts. The file must work without a network connection.</w:t>
               <w:br/>
-              <w:t>2. One slide for each storyboard row, in order. One slide = one claim = one exhibit.</w:t>
-              <w:br/>
-              <w:t>3. Charts: bar charts as div elements with widths from the data; line/scatter as inline SVG; tables as HTML tables. Use the real numbers from the evidence register. Do not invent data.</w:t>
-              <w:br/>
-              <w:t>4. Highlight: the one highlighted element gets #1f4fa8. All other data elements get #b0b8c4.</w:t>
-              <w:br/>
-              <w:t>5. Each slide: claim title at the top (2 lines maximum), exhibit in the centre (about 90% of the body), source line at the bottom.</w:t>
-              <w:br/>
-              <w:t>6. Speaker notes in a hidden block on each slide. The 'n' key shows and hides them.</w:t>
+              <w:t>2. One slide for each storyboard row, in order. One slide = one claim = one body. Include the fixed slides: cover, executive summary (class "summary": the SCQA in full prose), agenda (class "agenda", current section class "cur", repeated at each section break), conclusion, the ask.</w:t>
+              <w:br/>
+              <w:t>3. STANDALONE by default: each slide's body carries the full message to a reader with no presenter. Body forms: exhibit + short framing bullets; label rows (class "row" with "lab" and "cont"); quote cards; case template. Bold ONLY the load-bearing words. Set var LIVE=false in the script. (Live pitch only: set LIVE=true, strip bodies to the exhibit, move explanation to the notes.)</w:t>
+              <w:br/>
+              <w:t>4. Charts: bar charts as div elements with widths from the data; line/scatter as inline SVG; tables as HTML tables. Use the real numbers from the evidence register. Do not invent data.</w:t>
+              <w:br/>
+              <w:t>5. Highlight: the one highlighted element gets #1f4fa8. All other data elements get #b0b8c4.</w:t>
+              <w:br/>
+              <w:t>6. Each slide: kicker, claim title (2 lines maximum), body, source line at the bottom. Notes hold extra colour only; the 'n' key shows them.</w:t>
               <w:br/>
               <w:t>7. Use this skeleton. Keep the tokens and the script. Add the slides.</w:t>
               <w:br/>
@@ -7874,6 +7953,20 @@
               <w:br/>
               <w:t>.sowhat{border:1px solid var(--accent);background:#e8eef8;padding:14px;font-size:15px;}</w:t>
               <w:br/>
+              <w:t>.summary{border:1px solid var(--accent);padding:24px;font-size:16px;line-height:1.7;}</w:t>
+              <w:br/>
+              <w:t>.agenda{list-style:none;font-size:20px;max-width:600px;margin:0 auto;}</w:t>
+              <w:br/>
+              <w:t>.agenda li{padding:10px 16px;margin:6px 0;}</w:t>
+              <w:br/>
+              <w:t>.agenda li.cur{background:#dbe7f8;font-weight:600;}</w:t>
+              <w:br/>
+              <w:t>.row{display:flex;gap:16px;padding:10px 0;border-bottom:1px dotted var(--border);}</w:t>
+              <w:br/>
+              <w:t>.row .lab{flex:0 0 200px;background:#dbe7f8;padding:10px;font-weight:600;font-size:15px;}</w:t>
+              <w:br/>
+              <w:t>.row .cont{flex:1;font-size:15px;}</w:t>
+              <w:br/>
               <w:t>.exhibit{flex:1;display:flex;align-items:center;justify-content:center;}</w:t>
               <w:br/>
               <w:t>.exhibit&gt;*{width:100%;max-width:1000px;}</w:t>
@@ -7940,6 +8033,8 @@
               <w:br/>
               <w:t>&lt;script&gt;</w:t>
               <w:br/>
+              <w:t>var LIVE=false;</w:t>
+              <w:br/>
               <w:t>var s=document.querySelectorAll('.slide'),i=0;</w:t>
               <w:br/>
               <w:t>function show(n){s[i].classList.remove('active');i=(n+s.length)%s.length;s[i].classList.add('active');document.getElementById('ctr').textContent=(i+1)+' / '+s.length;}</w:t>
@@ -7970,7 +8065,7 @@
               <w:br/>
               <w:t>if(!so||5&gt;so.textContent.replace('Source:','').trim().length)out.push('Slide '+n+': no source line');</w:t>
               <w:br/>
-              <w:t>if(!sl.querySelector('.notes')||!sl.querySelector('.notes').textContent.trim())out.push('Slide '+n+': no speaker notes');}</w:t>
+              <w:t>if(LIVE&amp;&amp;(!sl.querySelector('.notes')||!sl.querySelector('.notes').textContent.trim()))out.push('Slide '+n+': no speaker notes');}</w:t>
               <w:br/>
               <w:t>show(k);var q=document.getElementById('qa');</w:t>
               <w:br/>
@@ -8007,7 +8102,7 @@
               <w:br/>
               <w:t>9. Make each exhibit fill its space. The exhibit content must use more than 40% of the height of its area. Bar charts: 40px bars, 18px labels. Tables: use class "x". If a slide shows a large empty area, the exhibit is too small. Make it larger.</w:t>
               <w:br/>
-              <w:t>10. Keep the QA script. It runs on the 'q' key and checks each slide: title present and 2 lines maximum, exhibit present and large, source line present, speaker notes present.</w:t>
+              <w:t>10. Keep the QA script. It runs on the 'q' key and checks each slide: title present and 2 lines maximum, body present and large, source line present, speaker notes present (live mode only).</w:t>
               <w:br/>
               <w:t>11. Before you give the output: test your work against rules 1-10. Add a table at the end: rule | PASS or FAIL | repair made. Repair each FAIL before you give the output.</w:t>
               <w:br/>
@@ -8166,7 +8261,7 @@
               <w:rPr>
                 <w:sz w:val="20"/>
               </w:rPr>
-              <w:t>✓ The 'n' key shows the correct notes on each slide.</w:t>
+              <w:t>✓ Standalone test: read three slides with the notes hidden. The full message must arrive from the slide alone.</w:t>
             </w:r>
           </w:p>
           <w:p>

</xml_diff>

<commit_message>
B11 becomes PPT handoff: zero-decision spec + template library
- New Pyramid_Deck_Templates.pptx: 11 pre-styled template slides
  (cover, exec summary, agenda, GT, chart+so-what, label rows, quotes,
  case, comparison table, scenario table, ask) in house style with
  bracketed placeholders and delete-me guidance notes
- B11: Part 1 spec-writer prompt (slide build cards, text verbatim,
  bold marked, real data tables, template mapping); Part 2 builder
  prompt for Copilot in PowerPoint (batch of 3-5, zero decisions);
  outline-diff verification in a fresh chat
- HTML deck route retained as explicit fallback
</commit_message>
<xml_diff>
--- a/Pyramid_Principle_Workbook.docx
+++ b/Pyramid_Principle_Workbook.docx
@@ -7669,7 +7669,7 @@
         <w:rPr>
           <w:color w:val="1F4FA8"/>
         </w:rPr>
-        <w:t>Step B11 — Build the HTML deck</w:t>
+        <w:t>Step B11 — Specify the deck and hand off to the builder</w:t>
       </w:r>
     </w:p>
     <w:p>
@@ -7679,7 +7679,7 @@
           <w:i/>
           <w:color w:val="718096"/>
         </w:rPr>
-        <w:t>Change the adjusted storyboard into one HTML file with the full deck.</w:t>
+        <w:t>Write a build specification so complete that the PowerPoint builder makes zero decisions.</w:t>
       </w:r>
     </w:p>
     <w:p>
@@ -7696,7 +7696,7 @@
           <w:color w:val="718096"/>
           <w:sz w:val="18"/>
         </w:rPr>
-        <w:t xml:space="preserve">adjusted storyboard (B10) + exhibit specifications (B6) + speaker notes   </w:t>
+        <w:t xml:space="preserve">adjusted storyboard (B10) + exhibit specifications (B6) + evidence register   </w:t>
       </w:r>
       <w:r>
         <w:rPr>
@@ -7711,7 +7711,543 @@
           <w:color w:val="718096"/>
           <w:sz w:val="18"/>
         </w:rPr>
-        <w:t>one self-contained HTML file with the complete deck</w:t>
+        <w:t>deck build specification + built .pptx deck</w:t>
+      </w:r>
+    </w:p>
+    <w:tbl>
+      <w:tblPr>
+        <w:tblStyle w:val="TableGrid"/>
+        <w:tblW w:type="auto" w:w="0"/>
+        <w:tblLook w:firstColumn="1" w:firstRow="1" w:lastColumn="0" w:lastRow="0" w:noHBand="0" w:noVBand="1" w:val="04A0"/>
+      </w:tblPr>
+      <w:tblGrid>
+        <w:gridCol w:w="8640"/>
+      </w:tblGrid>
+      <w:tr>
+        <w:tc>
+          <w:tcPr>
+            <w:tcW w:type="dxa" w:w="8640"/>
+            <w:shd w:fill="FDE8E8"/>
+          </w:tcPr>
+          <w:p>
+            <w:r>
+              <w:rPr>
+                <w:b/>
+                <w:color w:val="991B1B"/>
+                <w:sz w:val="18"/>
+              </w:rPr>
+              <w:t>THE ZERO-DECISION PRINCIPLE</w:t>
+            </w:r>
+          </w:p>
+          <w:p>
+            <w:r>
+              <w:rPr>
+                <w:sz w:val="20"/>
+              </w:rPr>
+              <w:t>Every decision was made in B1-B10. The builder executes; it does not decide. The specification carries: the text verbatim (with bold marked), the real data tables, the template slide for each layout, the colours as RGB values. If the builder must decide anything — a word, a number, a layout — the specification is not finished.</w:t>
+            </w:r>
+          </w:p>
+          <w:p>
+            <w:r>
+              <w:rPr>
+                <w:sz w:val="20"/>
+              </w:rPr>
+              <w:t>The template file: download Pyramid_Deck_Templates.pptx from the methods repo. It contains 11 pre-styled template slides: T1 cover / T2 executive summary / T3 agenda / T4 Governing Thought (text-only) / T5 chart + so-what panel / T6 label-and-content rows / T7 quote cards / T8 case template / T9 comparison table / T10 scenario table / T11 the ask.</w:t>
+            </w:r>
+          </w:p>
+          <w:p>
+            <w:r>
+              <w:rPr>
+                <w:sz w:val="20"/>
+              </w:rPr>
+              <w:t>Each placeholder is marked in brackets. The build = duplicate the matching template slide, replace the placeholders, delete the red template notes. The builder never designs a layout.</w:t>
+            </w:r>
+          </w:p>
+        </w:tc>
+      </w:tr>
+    </w:tbl>
+    <w:p/>
+    <w:p>
+      <w:pPr>
+        <w:pStyle w:val="Heading3"/>
+      </w:pPr>
+      <w:r>
+        <w:rPr>
+          <w:color w:val="166534"/>
+        </w:rPr>
+        <w:t>Copilot procedure — Part 1: write the specification</w:t>
+      </w:r>
+    </w:p>
+    <w:p>
+      <w:pPr>
+        <w:pStyle w:val="ListNumber"/>
+      </w:pPr>
+      <w:r>
+        <w:t>Compile the deck settings block: font Segoe UI for all text; colours as RGB — accent 31,79,168 / navy 15,39,68 / tint 219,231,248 / comparison grey 176,184,196 / muted 113,128,150; titles in accent, bold, sentence case, 2 lines maximum, no full stop; 16:9.</w:t>
+      </w:r>
+    </w:p>
+    <w:p>
+      <w:pPr>
+        <w:pStyle w:val="ListNumber"/>
+      </w:pPr>
+      <w:r>
+        <w:t>For each storyboard row, write one slide build card: SLIDE [n] — TEMPLATE [T1-T11]; KICKER (verbatim); TITLE (verbatim); BODY (all text verbatim, bold marked with **double asterisks**; charts get CHART TYPE + DATA TABLE with real numbers + HIGHLIGHT element + values-on ON + axes/gridlines/legend OFF); SOURCE (verbatim); NOTES (extra colour only).</w:t>
+      </w:r>
+    </w:p>
+    <w:p>
+      <w:pPr>
+        <w:pStyle w:val="ListNumber"/>
+      </w:pPr>
+      <w:r>
+        <w:t>Write cards for the fixed slides too: cover (T1), executive summary with the SCQA prose verbatim (T2), agenda + each agenda repeat with the current section named (T3), Governing Thought (T4), conclusion, the ask with gate and date (T11).</w:t>
+      </w:r>
+    </w:p>
+    <w:p>
+      <w:pPr>
+        <w:pStyle w:val="ListNumber"/>
+      </w:pPr>
+      <w:r>
+        <w:t>Completeness check: the specification contains no [TBD], no placeholder, no open choice. Every number matches the evidence register. Every card names its template slide.</w:t>
+      </w:r>
+    </w:p>
+    <w:tbl>
+      <w:tblPr>
+        <w:tblStyle w:val="TableGrid"/>
+        <w:tblW w:type="auto" w:w="0"/>
+        <w:tblLook w:firstColumn="1" w:firstRow="1" w:lastColumn="0" w:lastRow="0" w:noHBand="0" w:noVBand="1" w:val="04A0"/>
+      </w:tblPr>
+      <w:tblGrid>
+        <w:gridCol w:w="8640"/>
+      </w:tblGrid>
+      <w:tr>
+        <w:tc>
+          <w:tcPr>
+            <w:tcW w:type="dxa" w:w="8640"/>
+            <w:shd w:fill="F0EBFB"/>
+          </w:tcPr>
+          <w:p>
+            <w:r>
+              <w:rPr>
+                <w:b/>
+                <w:color w:val="5B21B6"/>
+                <w:sz w:val="18"/>
+              </w:rPr>
+              <w:t>PROMPT FOR COPILOT — copy the full block below into Copilot chat</w:t>
+            </w:r>
+          </w:p>
+          <w:p>
+            <w:r>
+              <w:rPr>
+                <w:rFonts w:ascii="Consolas" w:hAnsi="Consolas" w:eastAsia="Consolas"/>
+                <w:sz w:val="17"/>
+              </w:rPr>
+              <w:t>You do Step B11 Part 1 (Deck Build Specification) of a Minto presentation build.</w:t>
+              <w:br/>
+              <w:br/>
+              <w:t>Adjusted storyboard: [PASTE from B10]</w:t>
+              <w:br/>
+              <w:t>Exhibit specifications: [PASTE from B6]</w:t>
+              <w:br/>
+              <w:t>Evidence register (the real numbers): [PASTE]</w:t>
+              <w:br/>
+              <w:br/>
+              <w:t>Write a build specification for a PowerPoint builder. The builder makes ZERO decisions: every word, number, and layout choice must be in the specification.</w:t>
+              <w:br/>
+              <w:br/>
+              <w:t>Template slides available (the builder duplicates these):</w:t>
+              <w:br/>
+              <w:t>T1 cover / T2 executive summary (SCQA prose) / T3 agenda / T4 Governing Thought (text-only) / T5 chart + so-what panel / T6 label-and-content rows / T7 quote cards / T8 case template / T9 comparison table / T10 scenario table / T11 the ask</w:t>
+              <w:br/>
+              <w:br/>
+              <w:t>Do this:</w:t>
+              <w:br/>
+              <w:t>1. Deck settings block: font Segoe UI; colours RGB — accent 31,79,168 / navy 15,39,68 / tint 219,231,248 / grey 176,184,196 / muted 113,128,150; titles accent + bold + sentence case + 2 lines maximum + no full stop; 16:9.</w:t>
+              <w:br/>
+              <w:t>2. One slide build card per storyboard row, plus the fixed slides (cover, executive summary, agenda + repeats, Governing Thought, conclusion, ask). Card format:</w:t>
+              <w:br/>
+              <w:t xml:space="preserve">   SLIDE [n] — TEMPLATE [T#]</w:t>
+              <w:br/>
+              <w:t xml:space="preserve">   KICKER: [verbatim]</w:t>
+              <w:br/>
+              <w:t xml:space="preserve">   TITLE: [verbatim]</w:t>
+              <w:br/>
+              <w:t xml:space="preserve">   BODY: [all text verbatim; bold marked **like this**; charts get CHART TYPE + DATA TABLE (real numbers) + HIGHLIGHT element + values-on ON + axes/gridlines/legend OFF]</w:t>
+              <w:br/>
+              <w:t xml:space="preserve">   SOURCE: [verbatim]</w:t>
+              <w:br/>
+              <w:t xml:space="preserve">   NOTES: [extra colour only]</w:t>
+              <w:br/>
+              <w:t>3. Completeness check: no [TBD], no open choice, every number from the register, every card names its template. Report the check.</w:t>
+              <w:br/>
+              <w:br/>
+              <w:t>Output: deck settings block + all slide build cards + the completeness check result.</w:t>
+            </w:r>
+          </w:p>
+        </w:tc>
+      </w:tr>
+    </w:tbl>
+    <w:p/>
+    <w:p>
+      <w:pPr>
+        <w:pStyle w:val="Heading3"/>
+      </w:pPr>
+      <w:r>
+        <w:rPr>
+          <w:color w:val="166534"/>
+        </w:rPr>
+        <w:t>Copilot procedure — Part 2: drive the builder (Copilot in PowerPoint)</w:t>
+      </w:r>
+    </w:p>
+    <w:p>
+      <w:pPr>
+        <w:pStyle w:val="ListNumber"/>
+      </w:pPr>
+      <w:r>
+        <w:t>Open Pyramid_Deck_Templates.pptx. Save a copy with the deck name.</w:t>
+      </w:r>
+    </w:p>
+    <w:p>
+      <w:pPr>
+        <w:pStyle w:val="ListNumber"/>
+      </w:pPr>
+      <w:r>
+        <w:t>Work in batches of 3 to 5 slides. Large batches degrade builder accuracy.</w:t>
+      </w:r>
+    </w:p>
+    <w:p>
+      <w:pPr>
+        <w:pStyle w:val="ListNumber"/>
+      </w:pPr>
+      <w:r>
+        <w:t>For each batch: paste the builder prompt (below) + the deck settings block + the batch's slide cards into Copilot in PowerPoint.</w:t>
+      </w:r>
+    </w:p>
+    <w:p>
+      <w:pPr>
+        <w:pStyle w:val="ListNumber"/>
+      </w:pPr>
+      <w:r>
+        <w:t>After each batch: check each built slide against its card. List each deviation word for word. Instruct: "Repair these deviations: [paste]". Do not continue to the next batch with open deviations.</w:t>
+      </w:r>
+    </w:p>
+    <w:p>
+      <w:pPr>
+        <w:pStyle w:val="ListNumber"/>
+      </w:pPr>
+      <w:r>
+        <w:t>If Copilot in PowerPoint cannot execute a card (complex chart, case screenshot), build that element by hand from the template slide. The template makes manual work mechanical too.</w:t>
+      </w:r>
+    </w:p>
+    <w:p>
+      <w:pPr>
+        <w:pStyle w:val="ListNumber"/>
+      </w:pPr>
+      <w:r>
+        <w:t>Delete the red template notes and all unused template slides. Check the page numbers.</w:t>
+      </w:r>
+    </w:p>
+    <w:tbl>
+      <w:tblPr>
+        <w:tblStyle w:val="TableGrid"/>
+        <w:tblW w:type="auto" w:w="0"/>
+        <w:tblLook w:firstColumn="1" w:firstRow="1" w:lastColumn="0" w:lastRow="0" w:noHBand="0" w:noVBand="1" w:val="04A0"/>
+      </w:tblPr>
+      <w:tblGrid>
+        <w:gridCol w:w="8640"/>
+      </w:tblGrid>
+      <w:tr>
+        <w:tc>
+          <w:tcPr>
+            <w:tcW w:type="dxa" w:w="8640"/>
+            <w:shd w:fill="F0EBFB"/>
+          </w:tcPr>
+          <w:p>
+            <w:r>
+              <w:rPr>
+                <w:b/>
+                <w:color w:val="5B21B6"/>
+                <w:sz w:val="18"/>
+              </w:rPr>
+              <w:t>PROMPT FOR COPILOT — copy the full block below into Copilot chat</w:t>
+            </w:r>
+          </w:p>
+          <w:p>
+            <w:r>
+              <w:rPr>
+                <w:rFonts w:ascii="Consolas" w:hAnsi="Consolas" w:eastAsia="Consolas"/>
+                <w:sz w:val="17"/>
+              </w:rPr>
+              <w:t>BUILDER PROMPT — paste into Copilot in PowerPoint, per batch.</w:t>
+              <w:br/>
+              <w:br/>
+              <w:t>You build slides from the cards below, exactly.</w:t>
+              <w:br/>
+              <w:br/>
+              <w:t>Rules:</w:t>
+              <w:br/>
+              <w:t>1. For each card, duplicate the template slide it names (T1-T11) and replace the placeholders with the card content. Do not design new layouts.</w:t>
+              <w:br/>
+              <w:t>2. Use only the text in the cards. Do not write new text. Do not shorten text. Do not correct text.</w:t>
+              <w:br/>
+              <w:t>3. Apply bold exactly where the card marks **double asterisks**. Nothing else is bold.</w:t>
+              <w:br/>
+              <w:t>4. Build charts from the DATA TABLE in the card. Values on the data points. No axes, no gridlines, no legend. The HIGHLIGHT element gets RGB 31,79,168; all other elements get RGB 176,184,196.</w:t>
+              <w:br/>
+              <w:t>5. No stock images. No icons. No decoration. No extra slides. No design suggestions.</w:t>
+              <w:br/>
+              <w:t>6. Font: Segoe UI everywhere. Colours from the deck settings block.</w:t>
+              <w:br/>
+              <w:t>7. After the batch: list each card element you could not build exactly as specified.</w:t>
+              <w:br/>
+              <w:br/>
+              <w:t>Deck settings: [PASTE the settings block]</w:t>
+              <w:br/>
+              <w:t>Cards for this batch: [PASTE 3-5 slide cards]</w:t>
+            </w:r>
+          </w:p>
+        </w:tc>
+      </w:tr>
+    </w:tbl>
+    <w:p/>
+    <w:p>
+      <w:pPr>
+        <w:pStyle w:val="Heading3"/>
+      </w:pPr>
+      <w:r>
+        <w:rPr>
+          <w:color w:val="166534"/>
+        </w:rPr>
+        <w:t>Verification — the outline diff</w:t>
+      </w:r>
+    </w:p>
+    <w:p>
+      <w:pPr>
+        <w:pStyle w:val="ListNumber"/>
+      </w:pPr>
+      <w:r>
+        <w:t>In PowerPoint: View -&gt; Outline. Select all outline text and copy it.</w:t>
+      </w:r>
+    </w:p>
+    <w:p>
+      <w:pPr>
+        <w:pStyle w:val="ListNumber"/>
+      </w:pPr>
+      <w:r>
+        <w:t>Open a NEW Copilot chat (no history). Paste: "Compare this outline text to this specification. List each difference: missing text, changed text, wrong order, wrong slide. Outline: [paste]. Specification: [paste]."</w:t>
+      </w:r>
+    </w:p>
+    <w:p>
+      <w:pPr>
+        <w:pStyle w:val="ListNumber"/>
+      </w:pPr>
+      <w:r>
+        <w:t>Repair each difference in PowerPoint. Repeat until the diff is clean.</w:t>
+      </w:r>
+    </w:p>
+    <w:p>
+      <w:pPr>
+        <w:pStyle w:val="ListNumber"/>
+      </w:pPr>
+      <w:r>
+        <w:t>The outline diff checks text only. Charts, bold marks, and colours need your eyes: check each built slide against its card.</w:t>
+      </w:r>
+    </w:p>
+    <w:tbl>
+      <w:tblPr>
+        <w:tblStyle w:val="TableGrid"/>
+        <w:tblW w:type="auto" w:w="0"/>
+        <w:tblLook w:firstColumn="1" w:firstRow="1" w:lastColumn="0" w:lastRow="0" w:noHBand="0" w:noVBand="1" w:val="04A0"/>
+      </w:tblPr>
+      <w:tblGrid>
+        <w:gridCol w:w="8640"/>
+      </w:tblGrid>
+      <w:tr>
+        <w:tc>
+          <w:tcPr>
+            <w:tcW w:type="dxa" w:w="8640"/>
+            <w:shd w:fill="FFF8E6"/>
+          </w:tcPr>
+          <w:p>
+            <w:r>
+              <w:rPr>
+                <w:b/>
+                <w:color w:val="D4820A"/>
+                <w:sz w:val="18"/>
+              </w:rPr>
+              <w:t>YOUR REVIEW CHECKLIST — DO THE CHECKS IN THIS ORDER</w:t>
+            </w:r>
+          </w:p>
+          <w:p>
+            <w:r>
+              <w:rPr>
+                <w:sz w:val="20"/>
+              </w:rPr>
+              <w:t>✓ Specification check: no [TBD], no open choices, every card names a template slide, every number matches the register.</w:t>
+            </w:r>
+          </w:p>
+          <w:p>
+            <w:r>
+              <w:rPr>
+                <w:sz w:val="20"/>
+              </w:rPr>
+              <w:t>✓ Outline diff is clean: the built deck's outline text matches the specification word for word.</w:t>
+            </w:r>
+          </w:p>
+          <w:p>
+            <w:r>
+              <w:rPr>
+                <w:sz w:val="20"/>
+              </w:rPr>
+              <w:t>✓ Card-by-card visual check: bold discipline survived (only marked words are bold); charts show values, no axes, one accent highlight; sources present.</w:t>
+            </w:r>
+          </w:p>
+          <w:p>
+            <w:r>
+              <w:rPr>
+                <w:sz w:val="20"/>
+              </w:rPr>
+              <w:t>✓ Standalone test: read three slides cold. The full message must arrive from the slide alone.</w:t>
+            </w:r>
+          </w:p>
+          <w:p>
+            <w:r>
+              <w:rPr>
+                <w:sz w:val="20"/>
+              </w:rPr>
+              <w:t>✓ Data check: check five numbers against the evidence register. If one is wrong, check all. Only you can do this check.</w:t>
+            </w:r>
+          </w:p>
+          <w:p>
+            <w:r>
+              <w:rPr>
+                <w:sz w:val="20"/>
+              </w:rPr>
+              <w:t>✓ Template notes deleted; unused template slides deleted; page numbers correct.</w:t>
+            </w:r>
+          </w:p>
+        </w:tc>
+      </w:tr>
+    </w:tbl>
+    <w:p/>
+    <w:tbl>
+      <w:tblPr>
+        <w:tblStyle w:val="TableGrid"/>
+        <w:tblW w:type="auto" w:w="0"/>
+        <w:tblLook w:firstColumn="1" w:firstRow="1" w:lastColumn="0" w:lastRow="0" w:noHBand="0" w:noVBand="1" w:val="04A0"/>
+      </w:tblPr>
+      <w:tblGrid>
+        <w:gridCol w:w="8640"/>
+      </w:tblGrid>
+      <w:tr>
+        <w:tc>
+          <w:tcPr>
+            <w:tcW w:type="dxa" w:w="8640"/>
+            <w:shd w:fill="E8EEF8"/>
+          </w:tcPr>
+          <w:p>
+            <w:r>
+              <w:rPr>
+                <w:b/>
+                <w:color w:val="1F4FA8"/>
+                <w:sz w:val="18"/>
+              </w:rPr>
+              <w:t>OUTPUT — Deck file name + location + specification location</w:t>
+            </w:r>
+          </w:p>
+        </w:tc>
+      </w:tr>
+      <w:tr>
+        <w:tc>
+          <w:tcPr>
+            <w:tcW w:type="dxa" w:w="8640"/>
+          </w:tcPr>
+          <w:p/>
+          <w:p/>
+          <w:p/>
+          <w:p/>
+          <w:p/>
+        </w:tc>
+      </w:tr>
+      <w:tr>
+        <w:tc>
+          <w:tcPr>
+            <w:tcW w:type="dxa" w:w="8640"/>
+            <w:shd w:fill="E8EEF8"/>
+          </w:tcPr>
+          <w:p>
+            <w:r>
+              <w:rPr>
+                <w:b/>
+                <w:color w:val="1F4FA8"/>
+                <w:sz w:val="18"/>
+              </w:rPr>
+              <w:t>OUTPUT — Build deviations found + repairs (batch # | deviation | repair | repaired?)</w:t>
+            </w:r>
+          </w:p>
+        </w:tc>
+      </w:tr>
+      <w:tr>
+        <w:tc>
+          <w:tcPr>
+            <w:tcW w:type="dxa" w:w="8640"/>
+          </w:tcPr>
+          <w:p/>
+          <w:p/>
+          <w:p/>
+          <w:p/>
+          <w:p/>
+        </w:tc>
+      </w:tr>
+    </w:tbl>
+    <w:p/>
+    <w:tbl>
+      <w:tblPr>
+        <w:tblStyle w:val="TableGrid"/>
+        <w:tblW w:type="auto" w:w="0"/>
+        <w:tblLook w:firstColumn="1" w:firstRow="1" w:lastColumn="0" w:lastRow="0" w:noHBand="0" w:noVBand="1" w:val="04A0"/>
+      </w:tblPr>
+      <w:tblGrid>
+        <w:gridCol w:w="8640"/>
+      </w:tblGrid>
+      <w:tr>
+        <w:tc>
+          <w:tcPr>
+            <w:tcW w:type="dxa" w:w="8640"/>
+            <w:shd w:fill="E8EEF8"/>
+          </w:tcPr>
+          <w:p>
+            <w:r>
+              <w:rPr>
+                <w:b/>
+                <w:color w:val="1F4FA8"/>
+                <w:sz w:val="20"/>
+              </w:rPr>
+              <w:t>GATE: The specification has zero open decisions. The built deck matches it card for card. The numbers match the register.</w:t>
+            </w:r>
+          </w:p>
+        </w:tc>
+      </w:tr>
+    </w:tbl>
+    <w:p/>
+    <w:p>
+      <w:pPr>
+        <w:pStyle w:val="Heading3"/>
+      </w:pPr>
+      <w:r>
+        <w:rPr>
+          <w:color w:val="0F2744"/>
+        </w:rPr>
+        <w:t>Fallback route — HTML deck (no PowerPoint Copilot available)</w:t>
+      </w:r>
+    </w:p>
+    <w:p>
+      <w:r>
+        <w:rPr>
+          <w:b w:val="0"/>
+          <w:i/>
+          <w:color w:val="718096"/>
+        </w:rPr>
+        <w:t>Use this route when Copilot in PowerPoint is not available. It produces a self-contained HTML deck with a built-in QA check on the q key.</w:t>
       </w:r>
     </w:p>
     <w:tbl>
@@ -8411,7 +8947,7 @@
           <w:color w:val="718096"/>
           <w:sz w:val="18"/>
         </w:rPr>
-        <w:t xml:space="preserve">HTML deck (B11) + Q&amp;A sheet (B10)   </w:t>
+        <w:t xml:space="preserve">built deck (B11) + Q&amp;A sheet (B10)   </w:t>
       </w:r>
       <w:r>
         <w:rPr>

</xml_diff>

<commit_message>
Template library grows to 34 slides
Added: waterfall bridge, 100% stacked bar, line chart, RAG status
grid, Gantt workplan, KPI tiles, org chart, funnel, before/after,
risk register, option cards, next-steps-and-owners, appendix divider,
dense backup table. Rosters in workbook updated with grouped map.
</commit_message>
<xml_diff>
--- a/Pyramid_Principle_Workbook.docx
+++ b/Pyramid_Principle_Workbook.docx
@@ -7752,7 +7752,7 @@
               <w:rPr>
                 <w:sz w:val="20"/>
               </w:rPr>
-              <w:t>The template file: download Pyramid_Deck_Templates.pptx from the methods repo. It contains 11 pre-styled template slides: T1 cover / T2 executive summary / T3 agenda / T4 Governing Thought (text-only) / T5 chart + so-what panel / T6 label-and-content rows / T7 quote cards / T8 case template / T9 comparison table / T10 scenario table / T11 the ask.</w:t>
+              <w:t>The template file: download Pyramid_Deck_Templates.pptx from the methods repo. It contains 34 pre-styled template slides. Each placeholder is marked in brackets. The build = duplicate the matching template slide, replace the placeholders, delete the red template notes. The builder never designs a layout.</w:t>
             </w:r>
           </w:p>
           <w:p>
@@ -7760,7 +7760,47 @@
               <w:rPr>
                 <w:sz w:val="20"/>
               </w:rPr>
-              <w:t>Each placeholder is marked in brackets. The build = duplicate the matching template slide, replace the placeholders, delete the red template notes. The builder never designs a layout.</w:t>
+              <w:t>Structure: T1 cover / T2 executive summary / T3 agenda / T19 section divider / T33 appendix divider</w:t>
+            </w:r>
+          </w:p>
+          <w:p>
+            <w:r>
+              <w:rPr>
+                <w:sz w:val="20"/>
+              </w:rPr>
+              <w:t>Argument: T4 Governing Thought / T15 numbered process steps / T16 summary + detail / T11 the ask / T32 next steps &amp; owners</w:t>
+            </w:r>
+          </w:p>
+          <w:p>
+            <w:r>
+              <w:rPr>
+                <w:sz w:val="20"/>
+              </w:rPr>
+              <w:t>Charts: T5 bar / T12 time-series column / T13 pie / T20 scatter / T21 waterfall bridge / T22 100% stacked / T23 line / T28 funnel</w:t>
+            </w:r>
+          </w:p>
+          <w:p>
+            <w:r>
+              <w:rPr>
+                <w:sz w:val="20"/>
+              </w:rPr>
+              <w:t>Frameworks: T6 label rows / T14 2x2 matrix / T17 three parallel columns / T18 timeline + gate / T25 Gantt workplan / T27 org chart</w:t>
+            </w:r>
+          </w:p>
+          <w:p>
+            <w:r>
+              <w:rPr>
+                <w:sz w:val="20"/>
+              </w:rPr>
+              <w:t>Evidence and tables: T7 quote cards / T8 case template / T9 comparison table / T10 scenario table / T24 RAG status grid / T26 KPI tiles / T29 before-after / T30 risk register / T31 option cards / T34 dense backup table</w:t>
+            </w:r>
+          </w:p>
+          <w:p>
+            <w:r>
+              <w:rPr>
+                <w:sz w:val="20"/>
+              </w:rPr>
+              <w:t>Chart map from the B6 comparison types: item -&gt; T5; time series -&gt; T12 (few periods) or T23 (many); component -&gt; T13 (one period) or T22 (across periods); correlation -&gt; T20; frequency -&gt; T12; bridge -&gt; T21; conversion/funnel -&gt; T28.</w:t>
             </w:r>
           </w:p>
         </w:tc>
@@ -7856,7 +7896,17 @@
               <w:br/>
               <w:t>Template slides available (the builder duplicates these):</w:t>
               <w:br/>
-              <w:t>T1 cover / T2 executive summary (SCQA prose) / T3 agenda / T4 Governing Thought (text-only) / T5 chart + so-what panel / T6 label-and-content rows / T7 quote cards / T8 case template / T9 comparison table / T10 scenario table / T11 the ask</w:t>
+              <w:t>Structure: T1 cover / T2 executive summary (SCQA prose) / T3 agenda / T19 section divider / T33 appendix divider</w:t>
+              <w:br/>
+              <w:t>Argument: T4 Governing Thought / T15 numbered process steps / T16 summary + detail / T11 the ask / T32 next steps &amp; owners</w:t>
+              <w:br/>
+              <w:t>Charts: T5 bar / T12 time-series column / T13 pie / T20 scatter / T21 waterfall bridge / T22 100% stacked / T23 line / T28 funnel</w:t>
+              <w:br/>
+              <w:t>Frameworks: T6 label rows / T14 2x2 matrix / T17 three parallel columns / T18 timeline + gate / T25 Gantt workplan / T27 org chart</w:t>
+              <w:br/>
+              <w:t>Evidence/tables: T7 quote cards / T8 case template / T9 comparison table / T10 scenario table / T24 RAG status grid / T26 KPI tiles / T29 before-after / T30 risk register / T31 option cards / T34 dense backup table</w:t>
+              <w:br/>
+              <w:t>Chart map: item -&gt; T5; time series -&gt; T12 or T23; component -&gt; T13 or T22; correlation -&gt; T20; frequency -&gt; T12; bridge -&gt; T21; funnel -&gt; T28</w:t>
               <w:br/>
               <w:br/>
               <w:t>Do this:</w:t>

</xml_diff>

<commit_message>
B11: archetype spines checked before layout-slide assembly
</commit_message>
<xml_diff>
--- a/Pyramid_Principle_Workbook.docx
+++ b/Pyramid_Principle_Workbook.docx
@@ -7801,6 +7801,14 @@
                 <w:sz w:val="20"/>
               </w:rPr>
               <w:t>Chart map from the B6 comparison types: item -&gt; T5; time series -&gt; T12 (few periods) or T23 (many); component -&gt; T13 (one period) or T22 (across periods); correlation -&gt; T20; frequency -&gt; T12; bridge -&gt; T21; conversion/funnel -&gt; T28.</w:t>
+            </w:r>
+          </w:p>
+          <w:p>
+            <w:r>
+              <w:rPr>
+                <w:sz w:val="20"/>
+              </w:rPr>
+              <w:t>Archetype spines — check before you assemble from layout slides. Some question types have a complete pre-built deck spine in the methods repo: the full Minto sequence already assembled with placeholder text. When one matches your question, start from the spine and fill it; use T1-T34 only for slides the spine does not carry. Available: proposition-launch-deck/ — "which of these do we launch?" (options -&gt; gates -&gt; recommendation, 26 slides).</w:t>
             </w:r>
           </w:p>
         </w:tc>

</xml_diff>